<commit_message>
Modification du schéma de la BDD + Programmation classes
- Modification UML
</commit_message>
<xml_diff>
--- a/Documentation/LHO - M5 - DT.docx
+++ b/Documentation/LHO - M5 - DT.docx
@@ -910,7 +910,6 @@
           <w:r>
             <w:fldChar w:fldCharType="separate"/>
           </w:r>
-          <w:r/>
           <w:hyperlink w:tooltip="#_Toc1" w:anchor="_Toc1" w:history="1">
             <w:r>
               <w:rPr>
@@ -940,6 +939,7 @@
             </w:r>
           </w:hyperlink>
           <w:r/>
+          <w:r/>
         </w:p>
         <w:p>
           <w:pPr>
@@ -952,6 +952,7 @@
             <w:ind/>
             <w:rPr/>
           </w:pPr>
+          <w:r/>
           <w:hyperlink w:tooltip="#_Toc2" w:anchor="_Toc2" w:history="1">
             <w:r>
               <w:rPr>
@@ -988,6 +989,7 @@
             </w:r>
           </w:hyperlink>
           <w:r/>
+          <w:r/>
         </w:p>
         <w:p>
           <w:pPr>
@@ -1000,6 +1002,7 @@
             <w:ind/>
             <w:rPr/>
           </w:pPr>
+          <w:r/>
           <w:hyperlink w:tooltip="#_Toc3" w:anchor="_Toc3" w:history="1">
             <w:r>
               <w:rPr>
@@ -1036,6 +1039,7 @@
             </w:r>
           </w:hyperlink>
           <w:r/>
+          <w:r/>
         </w:p>
         <w:p>
           <w:pPr>
@@ -1048,6 +1052,7 @@
             <w:ind/>
             <w:rPr/>
           </w:pPr>
+          <w:r/>
           <w:hyperlink w:tooltip="#_Toc4" w:anchor="_Toc4" w:history="1">
             <w:r>
               <w:rPr>
@@ -1078,6 +1083,7 @@
             </w:r>
           </w:hyperlink>
           <w:r/>
+          <w:r/>
         </w:p>
         <w:p>
           <w:pPr>
@@ -1090,6 +1096,7 @@
             <w:ind/>
             <w:rPr/>
           </w:pPr>
+          <w:r/>
           <w:hyperlink w:tooltip="#_Toc5" w:anchor="_Toc5" w:history="1">
             <w:r>
               <w:rPr>
@@ -1125,6 +1132,7 @@
               <w:lang w:val="fr-CH"/>
             </w:rPr>
           </w:r>
+          <w:r/>
         </w:p>
         <w:p>
           <w:pPr>
@@ -1137,6 +1145,7 @@
             <w:ind/>
             <w:rPr/>
           </w:pPr>
+          <w:r/>
           <w:hyperlink w:tooltip="#_Toc6" w:anchor="_Toc6" w:history="1">
             <w:r>
               <w:rPr>
@@ -1206,6 +1215,7 @@
             </w:r>
           </w:hyperlink>
           <w:r/>
+          <w:r/>
         </w:p>
         <w:p>
           <w:pPr>
@@ -1218,6 +1228,7 @@
             <w:ind/>
             <w:rPr/>
           </w:pPr>
+          <w:r/>
           <w:hyperlink w:tooltip="#_Toc7" w:anchor="_Toc7" w:history="1">
             <w:r>
               <w:rPr>
@@ -1247,6 +1258,7 @@
             </w:r>
           </w:hyperlink>
           <w:r/>
+          <w:r/>
         </w:p>
         <w:p>
           <w:pPr>
@@ -1259,6 +1271,7 @@
             <w:ind/>
             <w:rPr/>
           </w:pPr>
+          <w:r/>
           <w:hyperlink w:tooltip="#_Toc8" w:anchor="_Toc8" w:history="1">
             <w:r>
               <w:rPr>
@@ -1328,6 +1341,7 @@
             </w:r>
           </w:hyperlink>
           <w:r/>
+          <w:r/>
         </w:p>
         <w:p>
           <w:pPr>
@@ -1340,6 +1354,7 @@
             <w:ind/>
             <w:rPr/>
           </w:pPr>
+          <w:r/>
           <w:hyperlink w:tooltip="#_Toc9" w:anchor="_Toc9" w:history="1">
             <w:r>
               <w:rPr>
@@ -1399,6 +1414,7 @@
             </w:r>
           </w:hyperlink>
           <w:r/>
+          <w:r/>
         </w:p>
         <w:p>
           <w:pPr>
@@ -1411,6 +1427,7 @@
             <w:ind/>
             <w:rPr/>
           </w:pPr>
+          <w:r/>
           <w:hyperlink w:tooltip="#_Toc10" w:anchor="_Toc10" w:history="1">
             <w:r>
               <w:rPr>
@@ -1442,6 +1459,7 @@
             </w:r>
           </w:hyperlink>
           <w:r/>
+          <w:r/>
         </w:p>
         <w:p>
           <w:pPr>
@@ -1454,6 +1472,7 @@
             <w:ind/>
             <w:rPr/>
           </w:pPr>
+          <w:r/>
           <w:hyperlink w:tooltip="#_Toc11" w:anchor="_Toc11" w:history="1">
             <w:r>
               <w:rPr>
@@ -1485,6 +1504,7 @@
             </w:r>
           </w:hyperlink>
           <w:r/>
+          <w:r/>
         </w:p>
         <w:p>
           <w:pPr>
@@ -1497,6 +1517,7 @@
             <w:ind/>
             <w:rPr/>
           </w:pPr>
+          <w:r/>
           <w:hyperlink w:tooltip="#_Toc12" w:anchor="_Toc12" w:history="1">
             <w:r>
               <w:rPr>
@@ -1534,6 +1555,7 @@
             </w:r>
           </w:hyperlink>
           <w:r/>
+          <w:r/>
         </w:p>
         <w:p>
           <w:pPr>
@@ -1546,6 +1568,7 @@
             <w:ind/>
             <w:rPr/>
           </w:pPr>
+          <w:r/>
           <w:hyperlink w:tooltip="#_Toc13" w:anchor="_Toc13" w:history="1">
             <w:r>
               <w:rPr>
@@ -1576,6 +1599,7 @@
             </w:r>
           </w:hyperlink>
           <w:r/>
+          <w:r/>
         </w:p>
         <w:p>
           <w:pPr>
@@ -1588,6 +1612,7 @@
             <w:ind/>
             <w:rPr/>
           </w:pPr>
+          <w:r/>
           <w:hyperlink w:tooltip="#_Toc14" w:anchor="_Toc14" w:history="1">
             <w:r>
               <w:rPr>
@@ -1618,6 +1643,7 @@
             </w:r>
           </w:hyperlink>
           <w:r/>
+          <w:r/>
         </w:p>
         <w:p>
           <w:pPr>
@@ -1630,6 +1656,7 @@
             <w:ind/>
             <w:rPr/>
           </w:pPr>
+          <w:r/>
           <w:hyperlink w:tooltip="#_Toc15" w:anchor="_Toc15" w:history="1">
             <w:r>
               <w:rPr>
@@ -1660,6 +1687,7 @@
             </w:r>
           </w:hyperlink>
           <w:r/>
+          <w:r/>
         </w:p>
         <w:p>
           <w:pPr>
@@ -1672,6 +1700,7 @@
             <w:ind/>
             <w:rPr/>
           </w:pPr>
+          <w:r/>
           <w:hyperlink w:tooltip="#_Toc16" w:anchor="_Toc16" w:history="1">
             <w:r>
               <w:rPr>
@@ -1703,6 +1732,7 @@
             </w:r>
           </w:hyperlink>
           <w:r/>
+          <w:r/>
         </w:p>
         <w:p>
           <w:pPr>
@@ -1715,6 +1745,7 @@
             <w:ind/>
             <w:rPr/>
           </w:pPr>
+          <w:r/>
           <w:hyperlink w:tooltip="#_Toc17" w:anchor="_Toc17" w:history="1">
             <w:r>
               <w:rPr>
@@ -1745,6 +1776,7 @@
             </w:r>
           </w:hyperlink>
           <w:r/>
+          <w:r/>
         </w:p>
         <w:p>
           <w:pPr>
@@ -1759,6 +1791,7 @@
               <w:highlight w:val="none"/>
             </w:rPr>
           </w:pPr>
+          <w:r/>
           <w:hyperlink w:tooltip="#_Toc18" w:anchor="_Toc18" w:history="1">
             <w:r>
               <w:rPr>
@@ -1797,6 +1830,11 @@
               <w:lang w:val="fr-CH"/>
             </w:rPr>
           </w:r>
+          <w:r>
+            <w:rPr>
+              <w:highlight w:val="none"/>
+            </w:rPr>
+          </w:r>
         </w:p>
         <w:p>
           <w:pPr>
@@ -1809,6 +1847,7 @@
             <w:ind/>
             <w:rPr/>
           </w:pPr>
+          <w:r/>
           <w:hyperlink w:tooltip="#_Toc19" w:anchor="_Toc19" w:history="1">
             <w:r>
               <w:rPr>
@@ -1859,6 +1898,7 @@
               <w:lang w:val="fr-CH"/>
             </w:rPr>
           </w:r>
+          <w:r/>
         </w:p>
         <w:p>
           <w:pPr>
@@ -1873,6 +1913,7 @@
               <w:highlight w:val="none"/>
             </w:rPr>
           </w:pPr>
+          <w:r/>
           <w:hyperlink w:tooltip="#_Toc20" w:anchor="_Toc20" w:history="1">
             <w:r>
               <w:rPr>
@@ -1909,6 +1950,11 @@
               <w:highlight w:val="none"/>
             </w:rPr>
           </w:r>
+          <w:r>
+            <w:rPr>
+              <w:highlight w:val="none"/>
+            </w:rPr>
+          </w:r>
         </w:p>
         <w:p>
           <w:pPr>
@@ -1921,6 +1967,7 @@
             <w:ind/>
             <w:rPr/>
           </w:pPr>
+          <w:r/>
           <w:hyperlink w:tooltip="#_Toc21" w:anchor="_Toc21" w:history="1">
             <w:r>
               <w:rPr>
@@ -1951,6 +1998,7 @@
             </w:r>
           </w:hyperlink>
           <w:r/>
+          <w:r/>
         </w:p>
         <w:p>
           <w:pPr>
@@ -1965,6 +2013,7 @@
               <w:highlight w:val="none"/>
             </w:rPr>
           </w:pPr>
+          <w:r/>
           <w:hyperlink w:tooltip="#_Toc22" w:anchor="_Toc22" w:history="1">
             <w:r>
               <w:rPr>
@@ -2003,6 +2052,11 @@
               <w:lang w:val="fr-CH"/>
             </w:rPr>
           </w:r>
+          <w:r>
+            <w:rPr>
+              <w:highlight w:val="none"/>
+            </w:rPr>
+          </w:r>
         </w:p>
         <w:p>
           <w:pPr>
@@ -2011,7 +2065,6 @@
             <w:ind/>
             <w:rPr/>
           </w:pPr>
-          <w:r/>
           <w:r>
             <w:rPr>
               <w:b/>
@@ -2019,7 +2072,6 @@
             </w:rPr>
             <w:fldChar w:fldCharType="end"/>
           </w:r>
-          <w:r/>
           <w:r/>
         </w:p>
       </w:sdtContent>
@@ -2055,7 +2107,6 @@
       <w:r>
         <w:t xml:space="preserve">1. Introduction</w:t>
       </w:r>
-      <w:r/>
       <w:bookmarkEnd w:id="16"/>
       <w:r/>
       <w:r/>
@@ -2317,7 +2368,6 @@
       <w:r>
         <w:t xml:space="preserve">Personnes impliquées</w:t>
       </w:r>
-      <w:r/>
       <w:bookmarkEnd w:id="17"/>
       <w:r/>
       <w:r/>
@@ -2455,7 +2505,6 @@
       <w:r>
         <w:t xml:space="preserve">Directives générales</w:t>
       </w:r>
-      <w:r/>
       <w:bookmarkEnd w:id="18"/>
       <w:r/>
       <w:r/>
@@ -2476,7 +2525,6 @@
         </w:rPr>
         <w:t xml:space="preserve">1.2.1 Remise</w:t>
       </w:r>
-      <w:r/>
       <w:bookmarkEnd w:id="19"/>
       <w:r/>
       <w:r/>
@@ -2698,7 +2746,11 @@
         </w:rPr>
       </w:r>
       <w:bookmarkEnd w:id="20"/>
-      <w:r/>
+      <w:r>
+        <w:rPr>
+          <w:lang w:val="fr-CH"/>
+        </w:rPr>
+      </w:r>
       <w:r>
         <w:rPr>
           <w:lang w:val="fr-CH"/>
@@ -2859,7 +2911,6 @@
         </w:rPr>
         <w:t xml:space="preserve">plication</w:t>
       </w:r>
-      <w:r/>
       <w:bookmarkEnd w:id="21"/>
       <w:r/>
       <w:r/>
@@ -2976,7 +3027,6 @@
       <w:r>
         <w:t xml:space="preserve">2.1 Public cible</w:t>
       </w:r>
-      <w:r/>
       <w:bookmarkEnd w:id="22"/>
       <w:r/>
       <w:r/>
@@ -3113,7 +3163,6 @@
       <w:r>
         <w:t xml:space="preserve"> </w:t>
       </w:r>
-      <w:r/>
       <w:bookmarkEnd w:id="23"/>
       <w:r/>
       <w:r/>
@@ -3867,7 +3916,6 @@
       <w:r>
         <w:t xml:space="preserve">Fonctionnelles</w:t>
       </w:r>
-      <w:r/>
       <w:bookmarkEnd w:id="24"/>
       <w:r/>
       <w:r/>
@@ -3984,7 +4032,6 @@
         </w:rPr>
         <w:t xml:space="preserve">2.4 Stockage des données persistantes</w:t>
       </w:r>
-      <w:r/>
       <w:bookmarkEnd w:id="25"/>
       <w:r/>
       <w:r/>
@@ -4074,7 +4121,6 @@
         </w:rPr>
         <w:t xml:space="preserve">2.4.1 Choix technologique</w:t>
       </w:r>
-      <w:r/>
       <w:bookmarkEnd w:id="26"/>
       <w:r/>
       <w:r/>
@@ -4283,7 +4329,6 @@
         </w:rPr>
         <w:t xml:space="preserve">Langage de programmation et Framework d'interface</w:t>
       </w:r>
-      <w:r/>
       <w:bookmarkEnd w:id="27"/>
       <w:r/>
       <w:r/>
@@ -4305,7 +4350,6 @@
         </w:rPr>
         <w:t xml:space="preserve">2.5.1 Langage : C# (.NET)</w:t>
       </w:r>
-      <w:r/>
       <w:bookmarkEnd w:id="28"/>
       <w:r/>
       <w:r/>
@@ -4542,7 +4586,6 @@
         </w:rPr>
         <w:t xml:space="preserve">2.5.2 Framework Graphique : Avalonia UI</w:t>
       </w:r>
-      <w:r/>
       <w:bookmarkEnd w:id="29"/>
       <w:r/>
       <w:r/>
@@ -4710,7 +4753,6 @@
         </w:rPr>
         <w:t xml:space="preserve">2.6 Architecture logiciel </w:t>
       </w:r>
-      <w:r/>
       <w:bookmarkEnd w:id="30"/>
       <w:r/>
       <w:r/>
@@ -5001,7 +5043,6 @@
         </w:rPr>
         <w:t xml:space="preserve">2.6.1 Architecture interne</w:t>
       </w:r>
-      <w:r/>
       <w:bookmarkEnd w:id="31"/>
       <w:r/>
       <w:r/>
@@ -5104,7 +5145,6 @@
         </w:rPr>
         <w:t xml:space="preserve">2.7 Diagramme de Cas d’Utilisation</w:t>
       </w:r>
-      <w:r/>
       <w:bookmarkEnd w:id="32"/>
       <w:r/>
       <w:r/>
@@ -5518,7 +5558,12 @@
         </w:rPr>
       </w:r>
       <w:bookmarkEnd w:id="33"/>
-      <w:r/>
+      <w:r>
+        <w:rPr>
+          <w:highlight w:val="none"/>
+          <w:lang w:val="fr-CH"/>
+        </w:rPr>
+      </w:r>
       <w:r>
         <w:rPr>
           <w:highlight w:val="none"/>
@@ -5598,7 +5643,11 @@
         </w:rPr>
       </w:r>
       <w:bookmarkEnd w:id="34"/>
-      <w:r/>
+      <w:r>
+        <w:rPr>
+          <w:lang w:val="fr-CH"/>
+        </w:rPr>
+      </w:r>
       <w:r>
         <w:rPr>
           <w:lang w:val="fr-CH"/>
@@ -9057,7 +9106,11 @@
         </w:rPr>
       </w:r>
       <w:bookmarkEnd w:id="35"/>
-      <w:r/>
+      <w:r>
+        <w:rPr>
+          <w:highlight w:val="none"/>
+        </w:rPr>
+      </w:r>
       <w:r>
         <w:rPr>
           <w:highlight w:val="none"/>
@@ -9146,7 +9199,6 @@
         </w:rPr>
         <w:t xml:space="preserve">3.1.1 Manipulation de données</w:t>
       </w:r>
-      <w:r/>
       <w:bookmarkEnd w:id="36"/>
       <w:r/>
       <w:r/>
@@ -9225,7 +9277,6 @@
                             </a:ext>
                           </a:extLst>
                         </a:blip>
-                        <a:stretch/>
                       </pic:blipFill>
                       <pic:spPr bwMode="auto">
                         <a:xfrm flipH="0" flipV="0">
@@ -9383,25 +9434,22 @@
           <w:highlight w:val="none"/>
           <w:lang w:val="fr-CH"/>
         </w:rPr>
-        <w:t xml:space="preserve"> </w:t>
-      </w:r>
-      <w:r>
-        <w:t xml:space="preserve">est la même pour tou</w:t>
+        <w:t xml:space="preserve"> unique pour chaques</w:t>
       </w:r>
       <w:r>
         <w:rPr>
           <w:lang w:val="fr-CH"/>
         </w:rPr>
-        <w:t xml:space="preserve">s les modules</w:t>
+        <w:t xml:space="preserve"> modules</w:t>
       </w:r>
       <w:r>
-        <w:t xml:space="preserve">. Il n'est pas nécessaire de recréer cette liste chaque </w:t>
+        <w:t xml:space="preserve">. </w:t>
       </w:r>
       <w:r>
         <w:rPr>
           <w:lang w:val="fr-CH"/>
         </w:rPr>
-        <w:t xml:space="preserve">module. </w:t>
+        <w:t xml:space="preserve">Cela permet de ne pas afficher des type inutile pour les module non-concerné (ex : l’affichage de “Programmation” dans le M1 n’est pas pertinant).</w:t>
       </w:r>
       <w:r>
         <w:rPr>
@@ -9579,31 +9627,6 @@
         </w:rPr>
       </w:r>
       <w:bookmarkEnd w:id="37"/>
-      <w:r/>
-      <w:r>
-        <w:rPr>
-          <w:highlight w:val="none"/>
-          <w:lang w:val="fr-CH"/>
-        </w:rPr>
-      </w:r>
-    </w:p>
-    <w:p>
-      <w:pPr>
-        <w:pStyle w:val="979"/>
-        <w:pBdr/>
-        <w:spacing/>
-        <w:ind/>
-        <w:rPr>
-          <w:highlight w:val="none"/>
-          <w:lang w:val="fr-CH"/>
-        </w:rPr>
-      </w:pPr>
-      <w:r>
-        <w:rPr>
-          <w:highlight w:val="none"/>
-          <w:lang w:val="fr-CH"/>
-        </w:rPr>
-      </w:r>
       <w:r>
         <w:rPr>
           <w:highlight w:val="none"/>
@@ -9633,6 +9656,7 @@
           <w:highlight w:val="none"/>
           <w:lang w:val="fr-CH" w:bidi="fr-CH"/>
         </w:rPr>
+        <w:t xml:space="preserve">EntityFramework</w:t>
       </w:r>
       <w:r>
         <w:rPr>
@@ -9836,7 +9860,60 @@
                 <w:sz w:val="24"/>
                 <w:szCs w:val="24"/>
               </w:rPr>
-              <w:t xml:space="preserve">LHO/</w:t>
+              <w:t xml:space="preserve">LHO</w:t>
+            </w:r>
+            <w:r>
+              <w:rPr>
+                <w:sz w:val="24"/>
+                <w:szCs w:val="24"/>
+              </w:rPr>
+              <w:fldChar w:fldCharType="begin"/>
+            </w:r>
+            <w:r>
+              <w:rPr>
+                <w:sz w:val="24"/>
+                <w:szCs w:val="24"/>
+              </w:rPr>
+              <w:instrText xml:space="preserve">TIME</w:instrText>
+            </w:r>
+            <w:r>
+              <w:rPr>
+                <w:sz w:val="24"/>
+                <w:szCs w:val="24"/>
+              </w:rPr>
+              <w:fldChar w:fldCharType="separate"/>
+            </w:r>
+            <w:r>
+              <w:rPr>
+                <w:sz w:val="24"/>
+                <w:szCs w:val="24"/>
+              </w:rPr>
+              <w:fldChar w:fldCharType="end"/>
+            </w:r>
+            <w:r>
+              <w:rPr>
+                <w:sz w:val="24"/>
+                <w:szCs w:val="24"/>
+              </w:rPr>
+            </w:r>
+            <w:r>
+              <w:rPr>
+                <w:sz w:val="24"/>
+                <w:szCs w:val="24"/>
+              </w:rPr>
+            </w:r>
+            <w:r>
+              <w:rPr>
+                <w:sz w:val="24"/>
+                <w:szCs w:val="24"/>
+              </w:rPr>
+            </w:r>
+            <w:r>
+              <w:rPr>
+                <w:sz w:val="24"/>
+                <w:szCs w:val="24"/>
+              </w:rPr>
+              <w:t xml:space="preserve">/</w:t>
             </w:r>
             <w:r>
               <w:rPr>
@@ -9844,7 +9921,6 @@
                 <w:szCs w:val="24"/>
                 <w:lang w:val="fr-CH"/>
               </w:rPr>
-              <w:t xml:space="preserve">0</w:t>
             </w:r>
             <w:r>
               <w:rPr>
@@ -9852,14 +9928,7 @@
                 <w:szCs w:val="24"/>
                 <w:lang w:val="fr-CH"/>
               </w:rPr>
-              <w:t xml:space="preserve">6</w:t>
-            </w:r>
-            <w:r>
-              <w:rPr>
-                <w:sz w:val="24"/>
-                <w:szCs w:val="24"/>
-              </w:rPr>
-              <w:t xml:space="preserve">.</w:t>
+              <w:fldChar w:fldCharType="begin"/>
             </w:r>
             <w:r>
               <w:rPr>
@@ -9867,14 +9936,66 @@
                 <w:szCs w:val="24"/>
                 <w:lang w:val="fr-CH"/>
               </w:rPr>
-              <w:t xml:space="preserve">02</w:t>
+              <w:instrText xml:space="preserve">TIME \@ "dd.MM.yy"</w:instrText>
             </w:r>
             <w:r>
               <w:rPr>
                 <w:sz w:val="24"/>
                 <w:szCs w:val="24"/>
+                <w:lang w:val="fr-CH"/>
               </w:rPr>
-              <w:t xml:space="preserve">.2025</w:t>
+              <w:fldChar w:fldCharType="separate"/>
+            </w:r>
+            <w:r>
+              <w:rPr>
+                <w:sz w:val="24"/>
+                <w:szCs w:val="24"/>
+                <w:lang w:val="fr-CH"/>
+              </w:rPr>
+              <w:t xml:space="preserve">03.03.26</w:t>
+            </w:r>
+            <w:r>
+              <w:rPr>
+                <w:sz w:val="24"/>
+                <w:szCs w:val="24"/>
+                <w:lang w:val="fr-CH"/>
+              </w:rPr>
+            </w:r>
+            <w:r>
+              <w:rPr>
+                <w:sz w:val="24"/>
+                <w:szCs w:val="24"/>
+                <w:lang w:val="fr-CH"/>
+              </w:rPr>
+              <w:fldChar w:fldCharType="end"/>
+            </w:r>
+            <w:r>
+              <w:rPr>
+                <w:sz w:val="24"/>
+                <w:szCs w:val="24"/>
+                <w:lang w:val="fr-CH"/>
+              </w:rPr>
+            </w:r>
+            <w:r>
+              <w:rPr>
+                <w:sz w:val="24"/>
+                <w:szCs w:val="24"/>
+                <w:lang w:val="fr-CH"/>
+              </w:rPr>
+            </w:r>
+            <w:r>
+              <w:rPr>
+                <w:sz w:val="24"/>
+                <w:szCs w:val="24"/>
+                <w:lang w:val="fr-CH"/>
+              </w:rPr>
+            </w:r>
+            <w:r>
+              <w:rPr>
+                <w:sz w:val="24"/>
+                <w:szCs w:val="24"/>
+                <w:lang w:val="fr-CH"/>
+              </w:rPr>
             </w:r>
             <w:r/>
           </w:p>

</xml_diff>

<commit_message>
Modification de la structure repertoire projet
- Structure projet -> Pages déplacés au bon endroit
- Documentation parametres et ressources globales
- Suivit planif
</commit_message>
<xml_diff>
--- a/Documentation/LHO - M5 - DT.docx
+++ b/Documentation/LHO - M5 - DT.docx
@@ -910,6 +910,7 @@
           <w:r>
             <w:fldChar w:fldCharType="separate"/>
           </w:r>
+          <w:r/>
           <w:hyperlink w:tooltip="#_Toc1" w:anchor="_Toc1" w:history="1">
             <w:r>
               <w:rPr>
@@ -938,7 +939,6 @@
               <w:fldChar w:fldCharType="end"/>
             </w:r>
           </w:hyperlink>
-          <w:r/>
           <w:r/>
         </w:p>
         <w:p>
@@ -952,7 +952,6 @@
             <w:ind/>
             <w:rPr/>
           </w:pPr>
-          <w:r/>
           <w:hyperlink w:tooltip="#_Toc2" w:anchor="_Toc2" w:history="1">
             <w:r>
               <w:rPr>
@@ -988,7 +987,6 @@
               <w:fldChar w:fldCharType="end"/>
             </w:r>
           </w:hyperlink>
-          <w:r/>
           <w:r/>
         </w:p>
         <w:p>
@@ -1002,7 +1000,6 @@
             <w:ind/>
             <w:rPr/>
           </w:pPr>
-          <w:r/>
           <w:hyperlink w:tooltip="#_Toc3" w:anchor="_Toc3" w:history="1">
             <w:r>
               <w:rPr>
@@ -1038,7 +1035,6 @@
               <w:fldChar w:fldCharType="end"/>
             </w:r>
           </w:hyperlink>
-          <w:r/>
           <w:r/>
         </w:p>
         <w:p>
@@ -1052,7 +1048,6 @@
             <w:ind/>
             <w:rPr/>
           </w:pPr>
-          <w:r/>
           <w:hyperlink w:tooltip="#_Toc4" w:anchor="_Toc4" w:history="1">
             <w:r>
               <w:rPr>
@@ -1082,7 +1077,6 @@
               <w:fldChar w:fldCharType="end"/>
             </w:r>
           </w:hyperlink>
-          <w:r/>
           <w:r/>
         </w:p>
         <w:p>
@@ -1096,7 +1090,6 @@
             <w:ind/>
             <w:rPr/>
           </w:pPr>
-          <w:r/>
           <w:hyperlink w:tooltip="#_Toc5" w:anchor="_Toc5" w:history="1">
             <w:r>
               <w:rPr>
@@ -1132,7 +1125,6 @@
               <w:lang w:val="fr-CH"/>
             </w:rPr>
           </w:r>
-          <w:r/>
         </w:p>
         <w:p>
           <w:pPr>
@@ -1145,7 +1137,6 @@
             <w:ind/>
             <w:rPr/>
           </w:pPr>
-          <w:r/>
           <w:hyperlink w:tooltip="#_Toc6" w:anchor="_Toc6" w:history="1">
             <w:r>
               <w:rPr>
@@ -1214,7 +1205,6 @@
               <w:fldChar w:fldCharType="end"/>
             </w:r>
           </w:hyperlink>
-          <w:r/>
           <w:r/>
         </w:p>
         <w:p>
@@ -1228,7 +1218,6 @@
             <w:ind/>
             <w:rPr/>
           </w:pPr>
-          <w:r/>
           <w:hyperlink w:tooltip="#_Toc7" w:anchor="_Toc7" w:history="1">
             <w:r>
               <w:rPr>
@@ -1257,7 +1246,6 @@
               <w:fldChar w:fldCharType="end"/>
             </w:r>
           </w:hyperlink>
-          <w:r/>
           <w:r/>
         </w:p>
         <w:p>
@@ -1271,7 +1259,6 @@
             <w:ind/>
             <w:rPr/>
           </w:pPr>
-          <w:r/>
           <w:hyperlink w:tooltip="#_Toc8" w:anchor="_Toc8" w:history="1">
             <w:r>
               <w:rPr>
@@ -1340,7 +1327,6 @@
               <w:fldChar w:fldCharType="end"/>
             </w:r>
           </w:hyperlink>
-          <w:r/>
           <w:r/>
         </w:p>
         <w:p>
@@ -1354,7 +1340,6 @@
             <w:ind/>
             <w:rPr/>
           </w:pPr>
-          <w:r/>
           <w:hyperlink w:tooltip="#_Toc9" w:anchor="_Toc9" w:history="1">
             <w:r>
               <w:rPr>
@@ -1413,7 +1398,6 @@
               <w:fldChar w:fldCharType="end"/>
             </w:r>
           </w:hyperlink>
-          <w:r/>
           <w:r/>
         </w:p>
         <w:p>
@@ -1427,7 +1411,6 @@
             <w:ind/>
             <w:rPr/>
           </w:pPr>
-          <w:r/>
           <w:hyperlink w:tooltip="#_Toc10" w:anchor="_Toc10" w:history="1">
             <w:r>
               <w:rPr>
@@ -1458,7 +1441,6 @@
               <w:fldChar w:fldCharType="end"/>
             </w:r>
           </w:hyperlink>
-          <w:r/>
           <w:r/>
         </w:p>
         <w:p>
@@ -1472,7 +1454,6 @@
             <w:ind/>
             <w:rPr/>
           </w:pPr>
-          <w:r/>
           <w:hyperlink w:tooltip="#_Toc11" w:anchor="_Toc11" w:history="1">
             <w:r>
               <w:rPr>
@@ -1503,7 +1484,6 @@
               <w:fldChar w:fldCharType="end"/>
             </w:r>
           </w:hyperlink>
-          <w:r/>
           <w:r/>
         </w:p>
         <w:p>
@@ -1517,7 +1497,6 @@
             <w:ind/>
             <w:rPr/>
           </w:pPr>
-          <w:r/>
           <w:hyperlink w:tooltip="#_Toc12" w:anchor="_Toc12" w:history="1">
             <w:r>
               <w:rPr>
@@ -1554,7 +1533,6 @@
               <w:fldChar w:fldCharType="end"/>
             </w:r>
           </w:hyperlink>
-          <w:r/>
           <w:r/>
         </w:p>
         <w:p>
@@ -1568,7 +1546,6 @@
             <w:ind/>
             <w:rPr/>
           </w:pPr>
-          <w:r/>
           <w:hyperlink w:tooltip="#_Toc13" w:anchor="_Toc13" w:history="1">
             <w:r>
               <w:rPr>
@@ -1598,7 +1575,6 @@
               <w:fldChar w:fldCharType="end"/>
             </w:r>
           </w:hyperlink>
-          <w:r/>
           <w:r/>
         </w:p>
         <w:p>
@@ -1612,7 +1588,6 @@
             <w:ind/>
             <w:rPr/>
           </w:pPr>
-          <w:r/>
           <w:hyperlink w:tooltip="#_Toc14" w:anchor="_Toc14" w:history="1">
             <w:r>
               <w:rPr>
@@ -1642,7 +1617,6 @@
               <w:fldChar w:fldCharType="end"/>
             </w:r>
           </w:hyperlink>
-          <w:r/>
           <w:r/>
         </w:p>
         <w:p>
@@ -1656,7 +1630,6 @@
             <w:ind/>
             <w:rPr/>
           </w:pPr>
-          <w:r/>
           <w:hyperlink w:tooltip="#_Toc15" w:anchor="_Toc15" w:history="1">
             <w:r>
               <w:rPr>
@@ -1686,7 +1659,6 @@
               <w:fldChar w:fldCharType="end"/>
             </w:r>
           </w:hyperlink>
-          <w:r/>
           <w:r/>
         </w:p>
         <w:p>
@@ -1700,7 +1672,6 @@
             <w:ind/>
             <w:rPr/>
           </w:pPr>
-          <w:r/>
           <w:hyperlink w:tooltip="#_Toc16" w:anchor="_Toc16" w:history="1">
             <w:r>
               <w:rPr>
@@ -1731,7 +1702,6 @@
               <w:fldChar w:fldCharType="end"/>
             </w:r>
           </w:hyperlink>
-          <w:r/>
           <w:r/>
         </w:p>
         <w:p>
@@ -1745,7 +1715,6 @@
             <w:ind/>
             <w:rPr/>
           </w:pPr>
-          <w:r/>
           <w:hyperlink w:tooltip="#_Toc17" w:anchor="_Toc17" w:history="1">
             <w:r>
               <w:rPr>
@@ -1775,7 +1744,6 @@
               <w:fldChar w:fldCharType="end"/>
             </w:r>
           </w:hyperlink>
-          <w:r/>
           <w:r/>
         </w:p>
         <w:p>
@@ -1789,7 +1757,6 @@
             <w:ind/>
             <w:rPr/>
           </w:pPr>
-          <w:r/>
           <w:hyperlink w:tooltip="#_Toc18" w:anchor="_Toc18" w:history="1">
             <w:r>
               <w:rPr>
@@ -1848,52 +1815,6 @@
               <w:lang w:val="fr-CH"/>
             </w:rPr>
           </w:r>
-          <w:r/>
-        </w:p>
-        <w:p>
-          <w:pPr>
-            <w:pStyle w:val="1588"/>
-            <w:pBdr/>
-            <w:tabs>
-              <w:tab w:val="right" w:leader="dot" w:pos="9061"/>
-            </w:tabs>
-            <w:spacing/>
-            <w:ind/>
-            <w:rPr/>
-          </w:pPr>
-          <w:r/>
-          <w:hyperlink w:tooltip="#_Toc19" w:anchor="_Toc19" w:history="1">
-            <w:r>
-              <w:rPr>
-                <w:rStyle w:val="1589"/>
-              </w:rPr>
-            </w:r>
-            <w:r>
-              <w:rPr>
-                <w:rStyle w:val="1589"/>
-                <w:highlight w:val="none"/>
-                <w:lang w:val="fr-CH" w:bidi="fr-CH"/>
-              </w:rPr>
-              <w:t xml:space="preserve">3. Conception de l’application</w:t>
-            </w:r>
-            <w:r>
-              <w:rPr>
-                <w:rStyle w:val="1589"/>
-              </w:rPr>
-            </w:r>
-            <w:r>
-              <w:tab/>
-            </w:r>
-            <w:r>
-              <w:fldChar w:fldCharType="begin"/>
-              <w:instrText xml:space="preserve">PAGEREF _Toc19 \h</w:instrText>
-              <w:fldChar w:fldCharType="separate"/>
-              <w:t xml:space="preserve">8</w:t>
-              <w:fldChar w:fldCharType="end"/>
-            </w:r>
-          </w:hyperlink>
-          <w:r/>
-          <w:r/>
         </w:p>
         <w:p>
           <w:pPr>
@@ -1908,8 +1829,7 @@
               <w:highlight w:val="none"/>
             </w:rPr>
           </w:pPr>
-          <w:r/>
-          <w:hyperlink w:tooltip="#_Toc20" w:anchor="_Toc20" w:history="1">
+          <w:hyperlink w:tooltip="#_Toc19" w:anchor="_Toc19" w:history="1">
             <w:r>
               <w:rPr>
                 <w:rStyle w:val="1589"/>
@@ -1921,13 +1841,13 @@
                 <w:highlight w:val="none"/>
                 <w:lang w:val="fr-CH" w:bidi="fr-CH"/>
               </w:rPr>
-              <w:t xml:space="preserve">3.1 Interface utilisateur</w:t>
+              <w:t xml:space="preserve">2.9 Interface utilisateur</w:t>
             </w:r>
             <w:r>
               <w:rPr>
                 <w:rStyle w:val="1589"/>
                 <w:highlight w:val="none"/>
-                <w:lang w:val="fr-CH"/>
+                <w:lang w:val="fr-CH" w:bidi="fr-CH"/>
               </w:rPr>
             </w:r>
             <w:r>
@@ -1935,7 +1855,7 @@
             </w:r>
             <w:r>
               <w:fldChar w:fldCharType="begin"/>
-              <w:instrText xml:space="preserve">PAGEREF _Toc20 \h</w:instrText>
+              <w:instrText xml:space="preserve">PAGEREF _Toc19 \h</w:instrText>
               <w:fldChar w:fldCharType="separate"/>
               <w:t xml:space="preserve">8</w:t>
               <w:fldChar w:fldCharType="end"/>
@@ -1944,11 +1864,7 @@
           <w:r>
             <w:rPr>
               <w:highlight w:val="none"/>
-            </w:rPr>
-          </w:r>
-          <w:r>
-            <w:rPr>
-              <w:highlight w:val="none"/>
+              <w:lang w:val="fr-CH" w:bidi="fr-CH"/>
             </w:rPr>
           </w:r>
         </w:p>
@@ -1965,8 +1881,7 @@
               <w:highlight w:val="none"/>
             </w:rPr>
           </w:pPr>
-          <w:r/>
-          <w:hyperlink w:tooltip="#_Toc21" w:anchor="_Toc21" w:history="1">
+          <w:hyperlink w:tooltip="#_Toc20" w:anchor="_Toc20" w:history="1">
             <w:r>
               <w:rPr>
                 <w:rStyle w:val="1589"/>
@@ -1978,52 +1893,7 @@
                 <w:highlight w:val="none"/>
                 <w:lang w:val="fr-CH" w:bidi="fr-CH"/>
               </w:rPr>
-              <w:t xml:space="preserve">3.1.1 Choix de design</w:t>
-            </w:r>
-            <w:r>
-              <w:rPr>
-                <w:rStyle w:val="1589"/>
-              </w:rPr>
-            </w:r>
-            <w:r>
-              <w:tab/>
-            </w:r>
-            <w:r>
-              <w:fldChar w:fldCharType="begin"/>
-              <w:instrText xml:space="preserve">PAGEREF _Toc21 \h</w:instrText>
-              <w:fldChar w:fldCharType="separate"/>
-              <w:t xml:space="preserve">8</w:t>
-              <w:fldChar w:fldCharType="end"/>
-            </w:r>
-          </w:hyperlink>
-          <w:r>
-            <w:rPr>
-              <w:highlight w:val="none"/>
-            </w:rPr>
-          </w:r>
-          <w:r>
-            <w:rPr>
-              <w:highlight w:val="none"/>
-            </w:rPr>
-          </w:r>
-        </w:p>
-        <w:p>
-          <w:pPr>
-            <w:pStyle w:val="1591"/>
-            <w:pBdr/>
-            <w:tabs>
-              <w:tab w:val="right" w:leader="dot" w:pos="9061"/>
-            </w:tabs>
-            <w:spacing/>
-            <w:ind/>
-            <w:rPr/>
-          </w:pPr>
-          <w:r/>
-          <w:hyperlink w:tooltip="#_Toc22" w:anchor="_Toc22" w:history="1">
-            <w:r>
-              <w:rPr>
-                <w:rStyle w:val="1589"/>
-              </w:rPr>
+              <w:t xml:space="preserve">2.9.1 Choix de design</w:t>
             </w:r>
             <w:r>
               <w:rPr>
@@ -2031,20 +1901,13 @@
                 <w:highlight w:val="none"/>
                 <w:lang w:val="fr-CH" w:bidi="fr-CH"/>
               </w:rPr>
-              <w:t xml:space="preserve">3.2 Pages</w:t>
-            </w:r>
-            <w:r>
-              <w:rPr>
-                <w:rStyle w:val="1589"/>
-                <w:lang w:val="fr-CH"/>
-              </w:rPr>
             </w:r>
             <w:r>
               <w:tab/>
             </w:r>
             <w:r>
               <w:fldChar w:fldCharType="begin"/>
-              <w:instrText xml:space="preserve">PAGEREF _Toc22 \h</w:instrText>
+              <w:instrText xml:space="preserve">PAGEREF _Toc20 \h</w:instrText>
               <w:fldChar w:fldCharType="separate"/>
               <w:t xml:space="preserve">8</w:t>
               <w:fldChar w:fldCharType="end"/>
@@ -2052,10 +1915,10 @@
           </w:hyperlink>
           <w:r>
             <w:rPr>
-              <w:lang w:val="fr-CH"/>
+              <w:highlight w:val="none"/>
+              <w:lang w:val="fr-CH" w:bidi="fr-CH"/>
             </w:rPr>
           </w:r>
-          <w:r/>
         </w:p>
         <w:p>
           <w:pPr>
@@ -2068,8 +1931,7 @@
             <w:ind/>
             <w:rPr/>
           </w:pPr>
-          <w:r/>
-          <w:hyperlink w:tooltip="#_Toc23" w:anchor="_Toc23" w:history="1">
+          <w:hyperlink w:tooltip="#_Toc21" w:anchor="_Toc21" w:history="1">
             <w:r>
               <w:rPr>
                 <w:rStyle w:val="1589"/>
@@ -2081,7 +1943,7 @@
                 <w:highlight w:val="none"/>
                 <w:lang w:val="fr-CH" w:bidi="fr-CH"/>
               </w:rPr>
-              <w:t xml:space="preserve">3.2.1 Accueil</w:t>
+              <w:t xml:space="preserve">2.9.2 Pages</w:t>
             </w:r>
             <w:r>
               <w:rPr>
@@ -2094,9 +1956,9 @@
             </w:r>
             <w:r>
               <w:fldChar w:fldCharType="begin"/>
-              <w:instrText xml:space="preserve">PAGEREF _Toc23 \h</w:instrText>
+              <w:instrText xml:space="preserve">PAGEREF _Toc21 \h</w:instrText>
               <w:fldChar w:fldCharType="separate"/>
-              <w:t xml:space="preserve">9</w:t>
+              <w:t xml:space="preserve">8</w:t>
               <w:fldChar w:fldCharType="end"/>
             </w:r>
           </w:hyperlink>
@@ -2105,7 +1967,6 @@
               <w:lang w:val="fr-CH"/>
             </w:rPr>
           </w:r>
-          <w:r/>
         </w:p>
         <w:p>
           <w:pPr>
@@ -2118,8 +1979,7 @@
             <w:ind/>
             <w:rPr/>
           </w:pPr>
-          <w:r/>
-          <w:hyperlink w:tooltip="#_Toc24" w:anchor="_Toc24" w:history="1">
+          <w:hyperlink w:tooltip="#_Toc22" w:anchor="_Toc22" w:history="1">
             <w:r>
               <w:rPr>
                 <w:rStyle w:val="1589"/>
@@ -2131,7 +1991,7 @@
                 <w:highlight w:val="none"/>
                 <w:lang w:val="fr-CH" w:bidi="fr-CH"/>
               </w:rPr>
-              <w:t xml:space="preserve">3.2.2</w:t>
+              <w:t xml:space="preserve">2.9.</w:t>
             </w:r>
             <w:r>
               <w:rPr>
@@ -2139,7 +1999,7 @@
                 <w:highlight w:val="none"/>
                 <w:lang w:val="fr-CH" w:bidi="fr-CH"/>
               </w:rPr>
-              <w:t xml:space="preserve"> Note</w:t>
+              <w:t xml:space="preserve">3 Accueil</w:t>
             </w:r>
             <w:r>
               <w:rPr>
@@ -2152,7 +2012,7 @@
             </w:r>
             <w:r>
               <w:fldChar w:fldCharType="begin"/>
-              <w:instrText xml:space="preserve">PAGEREF _Toc24 \h</w:instrText>
+              <w:instrText xml:space="preserve">PAGEREF _Toc22 \h</w:instrText>
               <w:fldChar w:fldCharType="separate"/>
               <w:t xml:space="preserve">9</w:t>
               <w:fldChar w:fldCharType="end"/>
@@ -2163,7 +2023,6 @@
               <w:lang w:val="fr-CH"/>
             </w:rPr>
           </w:r>
-          <w:r/>
         </w:p>
         <w:p>
           <w:pPr>
@@ -2176,8 +2035,7 @@
             <w:ind/>
             <w:rPr/>
           </w:pPr>
-          <w:r/>
-          <w:hyperlink w:tooltip="#_Toc25" w:anchor="_Toc25" w:history="1">
+          <w:hyperlink w:tooltip="#_Toc23" w:anchor="_Toc23" w:history="1">
             <w:r>
               <w:rPr>
                 <w:rStyle w:val="1589"/>
@@ -2189,13 +2047,23 @@
                 <w:highlight w:val="none"/>
                 <w:lang w:val="fr-CH" w:bidi="fr-CH"/>
               </w:rPr>
-              <w:t xml:space="preserve">3.2.3 </w:t>
+              <w:t xml:space="preserve">2.9</w:t>
             </w:r>
             <w:r>
               <w:rPr>
                 <w:rStyle w:val="1589"/>
+                <w:highlight w:val="none"/>
+                <w:lang w:val="fr-CH" w:bidi="fr-CH"/>
               </w:rPr>
-              <w:t xml:space="preserve">Journaux</w:t>
+              <w:t xml:space="preserve">.4</w:t>
+            </w:r>
+            <w:r>
+              <w:rPr>
+                <w:rStyle w:val="1589"/>
+                <w:highlight w:val="none"/>
+                <w:lang w:val="fr-CH" w:bidi="fr-CH"/>
+              </w:rPr>
+              <w:t xml:space="preserve"> Note</w:t>
             </w:r>
             <w:r>
               <w:rPr>
@@ -2208,9 +2076,9 @@
             </w:r>
             <w:r>
               <w:fldChar w:fldCharType="begin"/>
-              <w:instrText xml:space="preserve">PAGEREF _Toc25 \h</w:instrText>
+              <w:instrText xml:space="preserve">PAGEREF _Toc23 \h</w:instrText>
               <w:fldChar w:fldCharType="separate"/>
-              <w:t xml:space="preserve">10</w:t>
+              <w:t xml:space="preserve">9</w:t>
               <w:fldChar w:fldCharType="end"/>
             </w:r>
           </w:hyperlink>
@@ -2219,7 +2087,6 @@
               <w:lang w:val="fr-CH"/>
             </w:rPr>
           </w:r>
-          <w:r/>
         </w:p>
         <w:p>
           <w:pPr>
@@ -2232,8 +2099,7 @@
             <w:ind/>
             <w:rPr/>
           </w:pPr>
-          <w:r/>
-          <w:hyperlink w:tooltip="#_Toc26" w:anchor="_Toc26" w:history="1">
+          <w:hyperlink w:tooltip="#_Toc24" w:anchor="_Toc24" w:history="1">
             <w:r>
               <w:rPr>
                 <w:rStyle w:val="1589"/>
@@ -2245,7 +2111,13 @@
                 <w:highlight w:val="none"/>
                 <w:lang w:val="fr-CH" w:bidi="fr-CH"/>
               </w:rPr>
-              <w:t xml:space="preserve">3.2.4 Paramètres</w:t>
+              <w:t xml:space="preserve">2.9.5 </w:t>
+            </w:r>
+            <w:r>
+              <w:rPr>
+                <w:rStyle w:val="1589"/>
+              </w:rPr>
+              <w:t xml:space="preserve">Journaux</w:t>
             </w:r>
             <w:r>
               <w:rPr>
@@ -2258,9 +2130,9 @@
             </w:r>
             <w:r>
               <w:fldChar w:fldCharType="begin"/>
-              <w:instrText xml:space="preserve">PAGEREF _Toc26 \h</w:instrText>
+              <w:instrText xml:space="preserve">PAGEREF _Toc24 \h</w:instrText>
               <w:fldChar w:fldCharType="separate"/>
-              <w:t xml:space="preserve">11</w:t>
+              <w:t xml:space="preserve">10</w:t>
               <w:fldChar w:fldCharType="end"/>
             </w:r>
           </w:hyperlink>
@@ -2269,6 +2141,96 @@
               <w:lang w:val="fr-CH"/>
             </w:rPr>
           </w:r>
+        </w:p>
+        <w:p>
+          <w:pPr>
+            <w:pStyle w:val="1603"/>
+            <w:pBdr/>
+            <w:tabs>
+              <w:tab w:val="right" w:leader="dot" w:pos="9061"/>
+            </w:tabs>
+            <w:spacing/>
+            <w:ind/>
+            <w:rPr/>
+          </w:pPr>
+          <w:hyperlink w:tooltip="#_Toc25" w:anchor="_Toc25" w:history="1">
+            <w:r>
+              <w:rPr>
+                <w:rStyle w:val="1589"/>
+              </w:rPr>
+            </w:r>
+            <w:r>
+              <w:rPr>
+                <w:rStyle w:val="1589"/>
+                <w:highlight w:val="none"/>
+                <w:lang w:val="fr-CH" w:bidi="fr-CH"/>
+              </w:rPr>
+              <w:t xml:space="preserve">2.9.5 Paramètres</w:t>
+            </w:r>
+            <w:r>
+              <w:rPr>
+                <w:rStyle w:val="1589"/>
+                <w:lang w:val="fr-CH"/>
+              </w:rPr>
+            </w:r>
+            <w:r>
+              <w:tab/>
+            </w:r>
+            <w:r>
+              <w:fldChar w:fldCharType="begin"/>
+              <w:instrText xml:space="preserve">PAGEREF _Toc25 \h</w:instrText>
+              <w:fldChar w:fldCharType="separate"/>
+              <w:t xml:space="preserve">11</w:t>
+              <w:fldChar w:fldCharType="end"/>
+            </w:r>
+          </w:hyperlink>
+          <w:r>
+            <w:rPr>
+              <w:lang w:val="fr-CH"/>
+            </w:rPr>
+          </w:r>
+        </w:p>
+        <w:p>
+          <w:pPr>
+            <w:pStyle w:val="1588"/>
+            <w:pBdr/>
+            <w:tabs>
+              <w:tab w:val="right" w:leader="dot" w:pos="9061"/>
+            </w:tabs>
+            <w:spacing/>
+            <w:ind/>
+            <w:rPr/>
+          </w:pPr>
+          <w:hyperlink w:tooltip="#_Toc26" w:anchor="_Toc26" w:history="1">
+            <w:r>
+              <w:rPr>
+                <w:rStyle w:val="1589"/>
+              </w:rPr>
+            </w:r>
+            <w:r>
+              <w:rPr>
+                <w:rStyle w:val="1589"/>
+                <w:highlight w:val="none"/>
+                <w:lang w:val="fr-CH" w:bidi="fr-CH"/>
+              </w:rPr>
+              <w:t xml:space="preserve">3. Conception de l’application</w:t>
+            </w:r>
+            <w:r>
+              <w:rPr>
+                <w:rStyle w:val="1589"/>
+              </w:rPr>
+            </w:r>
+            <w:r>
+              <w:tab/>
+            </w:r>
+            <w:r>
+              <w:fldChar w:fldCharType="begin"/>
+              <w:instrText xml:space="preserve">PAGEREF _Toc26 \h</w:instrText>
+              <w:fldChar w:fldCharType="separate"/>
+              <w:t xml:space="preserve">11</w:t>
+              <w:fldChar w:fldCharType="end"/>
+            </w:r>
+          </w:hyperlink>
           <w:r/>
         </w:p>
         <w:p>
@@ -2284,7 +2246,6 @@
               <w:highlight w:val="none"/>
             </w:rPr>
           </w:pPr>
-          <w:r/>
           <w:hyperlink w:tooltip="#_Toc27" w:anchor="_Toc27" w:history="1">
             <w:r>
               <w:rPr>
@@ -2316,11 +2277,6 @@
               <w:fldChar w:fldCharType="end"/>
             </w:r>
           </w:hyperlink>
-          <w:r>
-            <w:rPr>
-              <w:highlight w:val="none"/>
-            </w:rPr>
-          </w:r>
           <w:r>
             <w:rPr>
               <w:highlight w:val="none"/>
@@ -2338,7 +2294,6 @@
             <w:ind/>
             <w:rPr/>
           </w:pPr>
-          <w:r/>
           <w:hyperlink w:tooltip="#_Toc28" w:anchor="_Toc28" w:history="1">
             <w:r>
               <w:rPr>
@@ -2368,7 +2323,6 @@
               <w:fldChar w:fldCharType="end"/>
             </w:r>
           </w:hyperlink>
-          <w:r/>
           <w:r/>
         </w:p>
         <w:p>
@@ -2384,7 +2338,6 @@
               <w:highlight w:val="none"/>
             </w:rPr>
           </w:pPr>
-          <w:r/>
           <w:hyperlink w:tooltip="#_Toc29" w:anchor="_Toc29" w:history="1">
             <w:r>
               <w:rPr>
@@ -2426,11 +2379,7 @@
           <w:r>
             <w:rPr>
               <w:highlight w:val="none"/>
-            </w:rPr>
-          </w:r>
-          <w:r>
-            <w:rPr>
-              <w:highlight w:val="none"/>
+              <w:lang w:val="fr-CH"/>
             </w:rPr>
           </w:r>
         </w:p>
@@ -2445,7 +2394,6 @@
             <w:ind/>
             <w:rPr/>
           </w:pPr>
-          <w:r/>
           <w:hyperlink w:tooltip="#_Toc30" w:anchor="_Toc30" w:history="1">
             <w:r>
               <w:rPr>
@@ -2488,7 +2436,6 @@
               <w:lang w:val="fr-CH"/>
             </w:rPr>
           </w:r>
-          <w:r/>
         </w:p>
         <w:p>
           <w:pPr>
@@ -2501,7 +2448,6 @@
             <w:ind/>
             <w:rPr/>
           </w:pPr>
-          <w:r/>
           <w:hyperlink w:tooltip="#_Toc31" w:anchor="_Toc31" w:history="1">
             <w:r>
               <w:rPr>
@@ -2546,7 +2492,6 @@
               <w:lang w:val="fr-CH"/>
             </w:rPr>
           </w:r>
-          <w:r/>
         </w:p>
         <w:p>
           <w:pPr>
@@ -2555,6 +2500,7 @@
             <w:ind/>
             <w:rPr/>
           </w:pPr>
+          <w:r/>
           <w:r>
             <w:rPr>
               <w:b/>
@@ -2563,6 +2509,7 @@
             <w:fldChar w:fldCharType="end"/>
           </w:r>
           <w:r/>
+          <w:r/>
         </w:p>
       </w:sdtContent>
     </w:sdt>
@@ -2597,6 +2544,7 @@
       <w:r>
         <w:t xml:space="preserve">1. Introduction</w:t>
       </w:r>
+      <w:r/>
       <w:bookmarkEnd w:id="16"/>
       <w:r/>
       <w:r/>
@@ -2858,6 +2806,7 @@
       <w:r>
         <w:t xml:space="preserve">Personnes impliquées</w:t>
       </w:r>
+      <w:r/>
       <w:bookmarkEnd w:id="17"/>
       <w:r/>
       <w:r/>
@@ -2995,6 +2944,7 @@
       <w:r>
         <w:t xml:space="preserve">Directives générales</w:t>
       </w:r>
+      <w:r/>
       <w:bookmarkEnd w:id="18"/>
       <w:r/>
       <w:r/>
@@ -3015,6 +2965,7 @@
         </w:rPr>
         <w:t xml:space="preserve">1.2.1 Remise</w:t>
       </w:r>
+      <w:r/>
       <w:bookmarkEnd w:id="19"/>
       <w:r/>
       <w:r/>
@@ -3236,11 +3187,7 @@
         </w:rPr>
       </w:r>
       <w:bookmarkEnd w:id="20"/>
-      <w:r>
-        <w:rPr>
-          <w:lang w:val="fr-CH"/>
-        </w:rPr>
-      </w:r>
+      <w:r/>
       <w:r>
         <w:rPr>
           <w:lang w:val="fr-CH"/>
@@ -3401,6 +3348,7 @@
         </w:rPr>
         <w:t xml:space="preserve">plication</w:t>
       </w:r>
+      <w:r/>
       <w:bookmarkEnd w:id="21"/>
       <w:r/>
       <w:r/>
@@ -3517,6 +3465,7 @@
       <w:r>
         <w:t xml:space="preserve">2.1 Public cible</w:t>
       </w:r>
+      <w:r/>
       <w:bookmarkEnd w:id="22"/>
       <w:r/>
       <w:r/>
@@ -3653,6 +3602,7 @@
       <w:r>
         <w:t xml:space="preserve"> </w:t>
       </w:r>
+      <w:r/>
       <w:bookmarkEnd w:id="23"/>
       <w:r/>
       <w:r/>
@@ -4412,6 +4362,7 @@
       <w:r>
         <w:t xml:space="preserve">Fonctionnelles</w:t>
       </w:r>
+      <w:r/>
       <w:bookmarkEnd w:id="24"/>
       <w:r/>
       <w:r/>
@@ -4528,6 +4479,7 @@
         </w:rPr>
         <w:t xml:space="preserve">2.4 Stockage des données persistantes</w:t>
       </w:r>
+      <w:r/>
       <w:bookmarkEnd w:id="25"/>
       <w:r/>
       <w:r/>
@@ -4617,6 +4569,7 @@
         </w:rPr>
         <w:t xml:space="preserve">2.4.1 Choix technologique</w:t>
       </w:r>
+      <w:r/>
       <w:bookmarkEnd w:id="26"/>
       <w:r/>
       <w:r/>
@@ -4825,6 +4778,7 @@
         </w:rPr>
         <w:t xml:space="preserve">Langage de programmation et Framework d'interface</w:t>
       </w:r>
+      <w:r/>
       <w:bookmarkEnd w:id="27"/>
       <w:r/>
       <w:r/>
@@ -4846,6 +4800,7 @@
         </w:rPr>
         <w:t xml:space="preserve">2.5.1 Langage : C# (.NET)</w:t>
       </w:r>
+      <w:r/>
       <w:bookmarkEnd w:id="28"/>
       <w:r/>
       <w:r/>
@@ -5082,6 +5037,7 @@
         </w:rPr>
         <w:t xml:space="preserve">2.5.2 Framework Graphique : Avalonia UI</w:t>
       </w:r>
+      <w:r/>
       <w:bookmarkEnd w:id="29"/>
       <w:r/>
       <w:r/>
@@ -5249,6 +5205,7 @@
         </w:rPr>
         <w:t xml:space="preserve">2.6 Architecture logiciel </w:t>
       </w:r>
+      <w:r/>
       <w:bookmarkEnd w:id="30"/>
       <w:r/>
       <w:r/>
@@ -5539,6 +5496,7 @@
         </w:rPr>
         <w:t xml:space="preserve">2.6.1 Architecture interne</w:t>
       </w:r>
+      <w:r/>
       <w:bookmarkEnd w:id="31"/>
       <w:r/>
       <w:r/>
@@ -5641,6 +5599,7 @@
         </w:rPr>
         <w:t xml:space="preserve">2.7 Diagramme de Cas d’Utilisation</w:t>
       </w:r>
+      <w:r/>
       <w:bookmarkEnd w:id="32"/>
       <w:r/>
       <w:r/>
@@ -6069,11 +6028,7 @@
         </w:rPr>
       </w:r>
       <w:bookmarkEnd w:id="33"/>
-      <w:r>
-        <w:rPr>
-          <w:lang w:val="fr-CH"/>
-        </w:rPr>
-      </w:r>
+      <w:r/>
       <w:r>
         <w:rPr>
           <w:lang w:val="fr-CH"/>
@@ -9576,7 +9531,7 @@
         </w:rPr>
       </w:pPr>
       <w:r/>
-      <w:bookmarkStart w:id="35" w:name="_Toc20"/>
+      <w:bookmarkStart w:id="34" w:name="_Toc19"/>
       <w:r>
         <w:rPr>
           <w:highlight w:val="none"/>
@@ -9590,13 +9545,8 @@
           <w:lang w:val="fr-CH" w:bidi="fr-CH"/>
         </w:rPr>
       </w:r>
-      <w:bookmarkEnd w:id="35"/>
-      <w:r>
-        <w:rPr>
-          <w:highlight w:val="none"/>
-          <w:lang w:val="fr-CH" w:bidi="fr-CH"/>
-        </w:rPr>
-      </w:r>
+      <w:bookmarkEnd w:id="34"/>
+      <w:r/>
       <w:r>
         <w:rPr>
           <w:highlight w:val="none"/>
@@ -9678,7 +9628,7 @@
         </w:rPr>
       </w:pPr>
       <w:r/>
-      <w:bookmarkStart w:id="36" w:name="_Toc21"/>
+      <w:bookmarkStart w:id="35" w:name="_Toc20"/>
       <w:r>
         <w:rPr>
           <w:highlight w:val="none"/>
@@ -9692,13 +9642,8 @@
           <w:lang w:val="fr-CH" w:bidi="fr-CH"/>
         </w:rPr>
       </w:r>
-      <w:bookmarkEnd w:id="36"/>
-      <w:r>
-        <w:rPr>
-          <w:highlight w:val="none"/>
-          <w:lang w:val="fr-CH" w:bidi="fr-CH"/>
-        </w:rPr>
-      </w:r>
+      <w:bookmarkEnd w:id="35"/>
+      <w:r/>
       <w:r>
         <w:rPr>
           <w:highlight w:val="none"/>
@@ -9847,7 +9792,7 @@
         </w:rPr>
       </w:pPr>
       <w:r/>
-      <w:bookmarkStart w:id="37" w:name="_Toc22"/>
+      <w:bookmarkStart w:id="36" w:name="_Toc21"/>
       <w:r>
         <w:rPr>
           <w:highlight w:val="none"/>
@@ -9855,12 +9800,13 @@
         </w:rPr>
         <w:t xml:space="preserve">2.9.2 Pages</w:t>
       </w:r>
-      <w:bookmarkEnd w:id="37"/>
       <w:r>
         <w:rPr>
           <w:lang w:val="fr-CH"/>
         </w:rPr>
       </w:r>
+      <w:bookmarkEnd w:id="36"/>
+      <w:r/>
       <w:r>
         <w:rPr>
           <w:lang w:val="fr-CH"/>
@@ -9956,7 +9902,7 @@
         </w:rPr>
       </w:pPr>
       <w:r/>
-      <w:bookmarkStart w:id="38" w:name="_Toc23"/>
+      <w:bookmarkStart w:id="37" w:name="_Toc22"/>
       <w:r>
         <mc:AlternateContent>
           <mc:Choice Requires="wpg">
@@ -10040,33 +9986,22 @@
           <w:highlight w:val="none"/>
           <w:lang w:val="fr-CH" w:bidi="fr-CH"/>
         </w:rPr>
+        <w:t xml:space="preserve">2.9.</w:t>
       </w:r>
       <w:r>
         <w:rPr>
           <w:highlight w:val="none"/>
           <w:lang w:val="fr-CH" w:bidi="fr-CH"/>
         </w:rPr>
-        <w:t xml:space="preserve">2.9.</w:t>
-      </w:r>
+        <w:t xml:space="preserve">3 Accueil</w:t>
+      </w:r>
+      <w:r>
+        <w:rPr>
+          <w:lang w:val="fr-CH"/>
+        </w:rPr>
+      </w:r>
+      <w:bookmarkEnd w:id="37"/>
       <w:r/>
-      <w:r>
-        <w:rPr>
-          <w:highlight w:val="none"/>
-          <w:lang w:val="fr-CH" w:bidi="fr-CH"/>
-        </w:rPr>
-        <w:t xml:space="preserve">3 Accueil</w:t>
-      </w:r>
-      <w:r>
-        <w:rPr>
-          <w:lang w:val="fr-CH"/>
-        </w:rPr>
-      </w:r>
-      <w:bookmarkEnd w:id="38"/>
-      <w:r>
-        <w:rPr>
-          <w:lang w:val="fr-CH"/>
-        </w:rPr>
-      </w:r>
       <w:r>
         <w:rPr>
           <w:lang w:val="fr-CH"/>
@@ -10505,32 +10440,26 @@
         </w:rPr>
       </w:pPr>
       <w:r/>
-      <w:bookmarkStart w:id="39" w:name="_Toc24"/>
+      <w:bookmarkStart w:id="38" w:name="_Toc23"/>
       <w:r>
         <w:rPr>
           <w:highlight w:val="none"/>
           <w:lang w:val="fr-CH" w:bidi="fr-CH"/>
         </w:rPr>
+        <w:t xml:space="preserve">2.9</w:t>
       </w:r>
       <w:r>
         <w:rPr>
           <w:highlight w:val="none"/>
           <w:lang w:val="fr-CH" w:bidi="fr-CH"/>
         </w:rPr>
-        <w:t xml:space="preserve">2.9</w:t>
+        <w:t xml:space="preserve">.4</w:t>
       </w:r>
       <w:r>
         <w:rPr>
           <w:highlight w:val="none"/>
           <w:lang w:val="fr-CH" w:bidi="fr-CH"/>
         </w:rPr>
-        <w:t xml:space="preserve">.4</w:t>
-      </w:r>
-      <w:r>
-        <w:rPr>
-          <w:highlight w:val="none"/>
-          <w:lang w:val="fr-CH" w:bidi="fr-CH"/>
-        </w:rPr>
         <w:t xml:space="preserve"> Note</w:t>
       </w:r>
       <w:r>
@@ -10538,12 +10467,8 @@
           <w:lang w:val="fr-CH"/>
         </w:rPr>
       </w:r>
-      <w:bookmarkEnd w:id="39"/>
-      <w:r>
-        <w:rPr>
-          <w:lang w:val="fr-CH"/>
-        </w:rPr>
-      </w:r>
+      <w:bookmarkEnd w:id="38"/>
+      <w:r/>
       <w:r>
         <w:rPr>
           <w:lang w:val="fr-CH"/>
@@ -10796,7 +10721,7 @@
         </w:rPr>
       </w:pPr>
       <w:r/>
-      <w:bookmarkStart w:id="40" w:name="_Toc25"/>
+      <w:bookmarkStart w:id="39" w:name="_Toc24"/>
       <w:r>
         <w:rPr>
           <w:highlight w:val="none"/>
@@ -10812,12 +10737,8 @@
           <w:lang w:val="fr-CH"/>
         </w:rPr>
       </w:r>
-      <w:bookmarkEnd w:id="40"/>
-      <w:r>
-        <w:rPr>
-          <w:lang w:val="fr-CH"/>
-        </w:rPr>
-      </w:r>
+      <w:bookmarkEnd w:id="39"/>
+      <w:r/>
       <w:r>
         <w:rPr>
           <w:lang w:val="fr-CH"/>
@@ -11891,7 +11812,7 @@
         </w:rPr>
       </w:pPr>
       <w:r/>
-      <w:bookmarkStart w:id="41" w:name="_Toc26"/>
+      <w:bookmarkStart w:id="40" w:name="_Toc25"/>
       <w:r>
         <w:rPr>
           <w:highlight w:val="none"/>
@@ -11899,12 +11820,13 @@
         </w:rPr>
         <w:t xml:space="preserve">2.9.5 Paramètres</w:t>
       </w:r>
-      <w:bookmarkEnd w:id="41"/>
       <w:r>
         <w:rPr>
           <w:lang w:val="fr-CH"/>
         </w:rPr>
       </w:r>
+      <w:bookmarkEnd w:id="40"/>
+      <w:r/>
       <w:r>
         <w:rPr>
           <w:lang w:val="fr-CH"/>
@@ -12192,43 +12114,42 @@
       </w:r>
       <w:r>
         <w:rPr>
+          <w:lang w:val="fr-CH"/>
+        </w:rPr>
+      </w:r>
+    </w:p>
+    <w:p>
+      <w:pPr>
+        <w:pBdr/>
+        <w:shd w:val="nil" w:color="000000"/>
+        <w:spacing/>
+        <w:ind/>
+        <w:rPr>
           <w:highlight w:val="none"/>
           <w:lang w:val="fr-CH"/>
         </w:rPr>
+      </w:pPr>
+      <w:r>
+        <w:rPr>
+          <w:highlight w:val="none"/>
+          <w:lang w:val="fr-CH"/>
+        </w:rPr>
+      </w:r>
+      <w:r>
+        <w:rPr>
+          <w:highlight w:val="none"/>
+          <w:lang w:val="fr-CH"/>
+        </w:rPr>
+      </w:r>
+      <w:r>
+        <w:rPr>
+          <w:highlight w:val="none"/>
+          <w:lang w:val="fr-CH"/>
+        </w:rPr>
       </w:r>
     </w:p>
     <w:p>
       <w:pPr>
-        <w:pBdr/>
-        <w:shd w:val="nil" w:color="000000"/>
-        <w:spacing/>
-        <w:ind/>
-        <w:rPr>
-          <w:highlight w:val="none"/>
-          <w:lang w:val="fr-CH"/>
-        </w:rPr>
-      </w:pPr>
-      <w:r>
-        <w:rPr>
-          <w:highlight w:val="none"/>
-          <w:lang w:val="fr-CH"/>
-        </w:rPr>
-      </w:r>
-      <w:r>
-        <w:rPr>
-          <w:highlight w:val="none"/>
-          <w:lang w:val="fr-CH"/>
-        </w:rPr>
-      </w:r>
-      <w:r>
-        <w:rPr>
-          <w:highlight w:val="none"/>
-          <w:lang w:val="fr-CH"/>
-        </w:rPr>
-      </w:r>
-    </w:p>
-    <w:p>
-      <w:pPr>
         <w:pStyle w:val="1391"/>
         <w:pBdr/>
         <w:spacing/>
@@ -12236,7 +12157,7 @@
         <w:rPr/>
       </w:pPr>
       <w:r/>
-      <w:bookmarkStart w:id="34" w:name="_Toc19"/>
+      <w:bookmarkStart w:id="41" w:name="_Toc26"/>
       <w:r>
         <w:rPr>
           <w:highlight w:val="none"/>
@@ -12244,13 +12165,8 @@
         </w:rPr>
         <w:t xml:space="preserve">3. Conception de l’application</w:t>
       </w:r>
-      <w:r>
-        <w:rPr>
-          <w:highlight w:val="none"/>
-          <w:lang w:val="fr-CH" w:bidi="fr-CH"/>
-        </w:rPr>
-      </w:r>
-      <w:bookmarkEnd w:id="34"/>
+      <w:r/>
+      <w:bookmarkEnd w:id="41"/>
       <w:r/>
       <w:r/>
     </w:p>
@@ -12315,6 +12231,7 @@
       </w:r>
       <w:r>
         <w:rPr>
+          <w:highlight w:val="none"/>
           <w:lang w:val="fr-CH"/>
         </w:rPr>
       </w:r>
@@ -12344,11 +12261,7 @@
         </w:rPr>
       </w:r>
       <w:bookmarkEnd w:id="42"/>
-      <w:r>
-        <w:rPr>
-          <w:highlight w:val="none"/>
-        </w:rPr>
-      </w:r>
+      <w:r/>
       <w:r>
         <w:rPr>
           <w:highlight w:val="none"/>
@@ -12437,6 +12350,7 @@
         </w:rPr>
         <w:t xml:space="preserve">3.2.1 Manipulation de données</w:t>
       </w:r>
+      <w:r/>
       <w:bookmarkEnd w:id="43"/>
       <w:r/>
       <w:r/>
@@ -12843,12 +12757,7 @@
         </w:rPr>
       </w:r>
       <w:bookmarkEnd w:id="44"/>
-      <w:r>
-        <w:rPr>
-          <w:highlight w:val="none"/>
-          <w:lang w:val="fr-CH"/>
-        </w:rPr>
-      </w:r>
+      <w:r/>
       <w:r>
         <w:rPr>
           <w:highlight w:val="none"/>
@@ -12957,11 +12866,7 @@
         </w:rPr>
       </w:r>
       <w:bookmarkEnd w:id="45"/>
-      <w:r>
-        <w:rPr>
-          <w:lang w:val="fr-CH"/>
-        </w:rPr>
-      </w:r>
+      <w:r/>
       <w:r>
         <w:rPr>
           <w:lang w:val="fr-CH"/>
@@ -13111,11 +13016,7 @@
         </w:rPr>
       </w:r>
       <w:bookmarkEnd w:id="46"/>
-      <w:r>
-        <w:rPr>
-          <w:lang w:val="fr-CH"/>
-        </w:rPr>
-      </w:r>
+      <w:r/>
       <w:r>
         <w:rPr>
           <w:lang w:val="fr-CH"/>
@@ -13336,6 +13237,861 @@
           <w:lang w:val="fr-CH"/>
         </w:rPr>
       </w:r>
+    </w:p>
+    <w:p>
+      <w:pPr>
+        <w:pStyle w:val="1392"/>
+        <w:pBdr/>
+        <w:spacing/>
+        <w:ind w:firstLine="0" w:left="0"/>
+        <w:rPr>
+          <w:lang w:val="fr-CH"/>
+        </w:rPr>
+      </w:pPr>
+      <w:r>
+        <w:rPr>
+          <w:highlight w:val="none"/>
+          <w:lang w:val="fr-CH" w:bidi="fr-CH"/>
+        </w:rPr>
+      </w:r>
+      <w:r>
+        <w:rPr>
+          <w:highlight w:val="none"/>
+          <w:lang w:val="fr-CH" w:bidi="fr-CH"/>
+        </w:rPr>
+        <w:t xml:space="preserve">3.3 </w:t>
+      </w:r>
+      <w:r>
+        <w:rPr>
+          <w:highlight w:val="none"/>
+          <w:lang w:val="fr-CH" w:bidi="fr-CH"/>
+        </w:rPr>
+        <w:t xml:space="preserve">Implémentation de la page Paramètres</w:t>
+      </w:r>
+      <w:r>
+        <w:rPr>
+          <w:highlight w:val="none"/>
+          <w:lang w:val="fr-CH" w:bidi="fr-CH"/>
+        </w:rPr>
+      </w:r>
+      <w:r>
+        <w:rPr>
+          <w:lang w:val="fr-CH"/>
+        </w:rPr>
+      </w:r>
+    </w:p>
+    <w:p>
+      <w:pPr>
+        <w:pBdr/>
+        <w:spacing/>
+        <w:ind/>
+        <w:rPr>
+          <w:highlight w:val="none"/>
+          <w:lang w:val="fr-CH" w:bidi="fr-CH"/>
+        </w:rPr>
+      </w:pPr>
+      <w:r>
+        <w:rPr>
+          <w:highlight w:val="none"/>
+          <w:lang w:val="fr-CH" w:bidi="fr-CH"/>
+        </w:rPr>
+      </w:r>
+      <w:r>
+        <w:rPr>
+          <w:highlight w:val="none"/>
+          <w:lang w:val="fr-CH" w:bidi="fr-CH"/>
+        </w:rPr>
+      </w:r>
+      <w:r>
+        <w:rPr>
+          <w:highlight w:val="none"/>
+          <w:lang w:val="fr-CH" w:bidi="fr-CH"/>
+        </w:rPr>
+        <w:t xml:space="preserve">Cette section détaille la réalisation technique de l'interface de configuration (SettingsPage.axaml et son code-behind), développée avec le framework Avalonia UI. Cette vue permet à l'utilisateur de configurer les éléments globaux du programme.</w:t>
+      </w:r>
+      <w:r>
+        <w:rPr>
+          <w:highlight w:val="none"/>
+          <w:lang w:val="fr-CH" w:bidi="fr-CH"/>
+        </w:rPr>
+      </w:r>
+      <w:r>
+        <w:rPr>
+          <w:lang w:val="fr-CH"/>
+        </w:rPr>
+      </w:r>
+    </w:p>
+    <w:p>
+      <w:pPr>
+        <w:pStyle w:val="1393"/>
+        <w:pBdr/>
+        <w:spacing/>
+        <w:ind/>
+        <w:rPr>
+          <w:lang w:val="fr-CH"/>
+        </w:rPr>
+      </w:pPr>
+      <w:r>
+        <w:rPr>
+          <w:highlight w:val="none"/>
+          <w:lang w:val="fr-CH" w:bidi="fr-CH"/>
+        </w:rPr>
+      </w:r>
+      <w:r>
+        <w:rPr>
+          <w:highlight w:val="none"/>
+          <w:lang w:val="fr-CH" w:bidi="fr-CH"/>
+        </w:rPr>
+        <w:t xml:space="preserve">3.3.1 </w:t>
+      </w:r>
+      <w:r>
+        <w:t xml:space="preserve">Gestion de l'apparence (Thème)</w:t>
+      </w:r>
+      <w:r>
+        <w:rPr>
+          <w:highlight w:val="none"/>
+          <w:lang w:val="fr-CH" w:bidi="fr-CH"/>
+        </w:rPr>
+      </w:r>
+      <w:r>
+        <w:rPr>
+          <w:lang w:val="fr-CH"/>
+        </w:rPr>
+      </w:r>
+    </w:p>
+    <w:p>
+      <w:pPr>
+        <w:pBdr/>
+        <w:spacing/>
+        <w:ind/>
+        <w:rPr>
+          <w:highlight w:val="none"/>
+          <w:lang w:val="fr-CH" w:bidi="fr-CH"/>
+        </w:rPr>
+      </w:pPr>
+      <w:r>
+        <w:rPr>
+          <w:highlight w:val="none"/>
+          <w:lang w:val="fr-CH" w:bidi="fr-CH"/>
+        </w:rPr>
+        <w:t xml:space="preserve">Bien que l’interface soit synchronisé </w:t>
+      </w:r>
+      <w:r>
+        <w:rPr>
+          <w:highlight w:val="none"/>
+          <w:lang w:val="fr-CH" w:bidi="fr-CH"/>
+        </w:rPr>
+        <w:t xml:space="preserve">avec le thème de l’appareil, l'interface intègre un commutateur (ToggleSwitch) permettant </w:t>
+      </w:r>
+      <w:r>
+        <w:rPr>
+          <w:highlight w:val="none"/>
+          <w:lang w:val="fr-CH" w:bidi="fr-CH"/>
+        </w:rPr>
+      </w:r>
+      <w:r>
+        <w:rPr>
+          <w:highlight w:val="none"/>
+          <w:lang w:val="fr-CH" w:bidi="fr-CH"/>
+        </w:rPr>
+        <w:t xml:space="preserve">à l'utilisateur de forcer le basculement entre le mode clair et le mode sombre. </w:t>
+      </w:r>
+      <w:r>
+        <w:rPr>
+          <w:highlight w:val="none"/>
+          <w:lang w:val="fr-CH" w:bidi="fr-CH"/>
+        </w:rPr>
+      </w:r>
+      <w:r>
+        <w:rPr>
+          <w:highlight w:val="none"/>
+          <w:lang w:val="fr-CH" w:bidi="fr-CH"/>
+        </w:rPr>
+        <w:t xml:space="preserve">Ce choix modifie le thème global de l'application.</w:t>
+      </w:r>
+      <w:r>
+        <w:rPr>
+          <w:highlight w:val="none"/>
+          <w:lang w:val="fr-CH" w:bidi="fr-CH"/>
+        </w:rPr>
+      </w:r>
+      <w:r>
+        <w:rPr>
+          <w:highlight w:val="none"/>
+          <w:lang w:val="fr-CH" w:bidi="fr-CH"/>
+        </w:rPr>
+      </w:r>
+      <w:r>
+        <w:rPr>
+          <w:highlight w:val="none"/>
+          <w:lang w:val="fr-CH" w:bidi="fr-CH"/>
+        </w:rPr>
+      </w:r>
+      <w:r>
+        <w:rPr>
+          <w:lang w:val="fr-CH"/>
+        </w:rPr>
+      </w:r>
+      <w:r/>
+      <w:r>
+        <w:rPr>
+          <w:highlight w:val="none"/>
+          <w:lang w:val="fr-CH" w:bidi="fr-CH"/>
+        </w:rPr>
+      </w:r>
+    </w:p>
+    <w:p>
+      <w:pPr>
+        <w:pBdr/>
+        <w:spacing/>
+        <w:ind/>
+        <w:rPr>
+          <w:highlight w:val="none"/>
+        </w:rPr>
+      </w:pPr>
+      <w:r>
+        <w:rPr>
+          <w:highlight w:val="none"/>
+          <w:lang w:val="fr-CH" w:bidi="fr-CH"/>
+        </w:rPr>
+        <w:t xml:space="preserve">Pour garantir une parfaite intégration visuelle, l'ensemble des éléme</w:t>
+      </w:r>
+      <w:r>
+        <w:rPr>
+          <w:highlight w:val="none"/>
+          <w:lang w:val="fr-CH" w:bidi="fr-CH"/>
+        </w:rPr>
+        <w:t xml:space="preserve">nts (couleurs de fond, bordures, typographies) utilise des ressources dynamiques (DynamicResource) qui proviennent du dictionnaire principal de l'application.</w:t>
+      </w:r>
+      <w:r/>
+      <w:r>
+        <w:rPr>
+          <w:lang w:val="fr-CH"/>
+        </w:rPr>
+      </w:r>
+    </w:p>
+    <w:p>
+      <w:pPr>
+        <w:pStyle w:val="1393"/>
+        <w:pBdr/>
+        <w:spacing/>
+        <w:ind/>
+        <w:rPr>
+          <w:lang w:val="fr-CH"/>
+        </w:rPr>
+      </w:pPr>
+      <w:r>
+        <w:rPr>
+          <w:highlight w:val="none"/>
+          <w:lang w:val="fr-CH" w:bidi="fr-CH"/>
+        </w:rPr>
+      </w:r>
+      <w:r>
+        <w:rPr>
+          <w:highlight w:val="none"/>
+          <w:lang w:val="fr-CH" w:bidi="fr-CH"/>
+        </w:rPr>
+        <w:t xml:space="preserve">3.3.2 </w:t>
+      </w:r>
+      <w:r>
+        <w:rPr>
+          <w:highlight w:val="none"/>
+          <w:lang w:val="fr-CH" w:bidi="fr-CH"/>
+        </w:rPr>
+        <w:t xml:space="preserve">Gestion de la base de données (Chemin d'accès)</w:t>
+      </w:r>
+      <w:r>
+        <w:rPr>
+          <w:highlight w:val="none"/>
+          <w:lang w:val="fr-CH" w:bidi="fr-CH"/>
+        </w:rPr>
+      </w:r>
+      <w:r>
+        <w:rPr>
+          <w:lang w:val="fr-CH"/>
+        </w:rPr>
+      </w:r>
+    </w:p>
+    <w:p>
+      <w:pPr>
+        <w:pBdr/>
+        <w:spacing/>
+        <w:ind/>
+        <w:rPr>
+          <w:highlight w:val="none"/>
+          <w:lang w:val="fr-CH" w:bidi="fr-CH"/>
+        </w:rPr>
+      </w:pPr>
+      <w:r>
+        <w:rPr>
+          <w:highlight w:val="none"/>
+          <w:lang w:val="fr-CH" w:bidi="fr-CH"/>
+        </w:rPr>
+      </w:r>
+      <w:r>
+        <w:rPr>
+          <w:highlight w:val="none"/>
+          <w:lang w:val="fr-CH" w:bidi="fr-CH"/>
+        </w:rPr>
+      </w:r>
+      <w:r>
+        <w:rPr>
+          <w:highlight w:val="none"/>
+          <w:lang w:val="fr-CH" w:bidi="fr-CH"/>
+        </w:rPr>
+        <w:t xml:space="preserve">Une carte dédiée permet de configurer l'emplacement du fichier de sauvegarde SQLite (.db).</w:t>
+      </w:r>
+      <w:r>
+        <w:rPr>
+          <w:lang w:val="fr-CH"/>
+        </w:rPr>
+      </w:r>
+    </w:p>
+    <w:p>
+      <w:pPr>
+        <w:pBdr/>
+        <w:spacing/>
+        <w:ind/>
+        <w:rPr>
+          <w:highlight w:val="none"/>
+          <w:lang w:val="fr-CH" w:bidi="fr-CH"/>
+        </w:rPr>
+      </w:pPr>
+      <w:r>
+        <w:rPr>
+          <w:highlight w:val="none"/>
+          <w:lang w:val="fr-CH" w:bidi="fr-CH"/>
+        </w:rPr>
+        <w:t xml:space="preserve">Sélection de fichier : Un bouton "parcourir" est lié à une commande (BrowseFileCommand) qui ouvre un sélecteur de fichiers natif à l’OS utilisé.</w:t>
+      </w:r>
+      <w:r>
+        <w:rPr>
+          <w:lang w:val="fr-CH"/>
+        </w:rPr>
+      </w:r>
+    </w:p>
+    <w:p>
+      <w:pPr>
+        <w:pBdr/>
+        <w:spacing/>
+        <w:ind/>
+        <w:rPr>
+          <w:highlight w:val="none"/>
+          <w:lang w:val="fr-CH" w:bidi="fr-CH"/>
+        </w:rPr>
+      </w:pPr>
+      <w:r>
+        <w:rPr>
+          <w:highlight w:val="none"/>
+          <w:lang w:val="fr-CH" w:bidi="fr-CH"/>
+        </w:rPr>
+        <w:t xml:space="preserve">Validation des saisies : Le système vé</w:t>
+      </w:r>
+      <w:r>
+        <w:rPr>
+          <w:highlight w:val="none"/>
+          <w:lang w:val="fr-CH" w:bidi="fr-CH"/>
+        </w:rPr>
+        <w:t xml:space="preserve">rifie la validité du chemin fourni par l'utilisateur.</w:t>
+      </w:r>
+      <w:r>
+        <w:rPr>
+          <w:lang w:val="fr-CH"/>
+        </w:rPr>
+      </w:r>
+    </w:p>
+    <w:p>
+      <w:pPr>
+        <w:pBdr/>
+        <w:spacing/>
+        <w:ind/>
+        <w:rPr>
+          <w:highlight w:val="none"/>
+        </w:rPr>
+      </w:pPr>
+      <w:r>
+        <w:rPr>
+          <w:highlight w:val="none"/>
+          <w:lang w:val="fr-CH" w:bidi="fr-CH"/>
+        </w:rPr>
+        <w:t xml:space="preserve">Gestion des erreurs : Si le fichier est introuvable, une bulle d'alerte contextuelle (Flyout) s'affiche directement sous le champ de texte. Cette alerte informe visuellement l'utilisateur que le fichier e</w:t>
+      </w:r>
+      <w:r>
+        <w:rPr>
+          <w:highlight w:val="none"/>
+          <w:lang w:val="fr-CH" w:bidi="fr-CH"/>
+        </w:rPr>
+        <w:t xml:space="preserve">st introuvable et précise que la modification du chemin n'a pas été enregistrée.</w:t>
+      </w:r>
+      <w:r/>
+      <w:r>
+        <w:rPr>
+          <w:lang w:val="fr-CH"/>
+        </w:rPr>
+      </w:r>
+    </w:p>
+    <w:p>
+      <w:pPr>
+        <w:pBdr/>
+        <w:shd w:val="nil"/>
+        <w:spacing/>
+        <w:ind/>
+        <w:rPr>
+          <w:lang w:val="fr-CH"/>
+        </w:rPr>
+      </w:pPr>
+      <w:r>
+        <w:rPr>
+          <w:lang w:val="fr-CH"/>
+        </w:rPr>
+        <w:br w:type="page" w:clear="all"/>
+      </w:r>
+      <w:r>
+        <w:rPr>
+          <w:lang w:val="fr-CH"/>
+        </w:rPr>
+      </w:r>
+      <w:r>
+        <w:rPr>
+          <w:lang w:val="fr-CH"/>
+        </w:rPr>
+      </w:r>
+    </w:p>
+    <w:p>
+      <w:pPr>
+        <w:pStyle w:val="1392"/>
+        <w:pBdr/>
+        <w:spacing/>
+        <w:ind/>
+        <w:rPr>
+          <w:lang w:val="fr-CH"/>
+        </w:rPr>
+      </w:pPr>
+      <w:r>
+        <w:rPr>
+          <w:highlight w:val="none"/>
+          <w:lang w:val="fr-CH" w:bidi="fr-CH"/>
+        </w:rPr>
+        <w:t xml:space="preserve">3.4 Design et ressources globales</w:t>
+      </w:r>
+      <w:r>
+        <w:rPr>
+          <w:lang w:val="fr-CH"/>
+        </w:rPr>
+      </w:r>
+    </w:p>
+    <w:p>
+      <w:pPr>
+        <w:pBdr/>
+        <w:spacing/>
+        <w:ind/>
+        <w:rPr>
+          <w:highlight w:val="none"/>
+          <w:lang w:val="fr-CH" w:bidi="fr-CH"/>
+        </w:rPr>
+      </w:pPr>
+      <w:r>
+        <w:rPr>
+          <w:highlight w:val="none"/>
+          <w:lang w:val="fr-CH" w:bidi="fr-CH"/>
+        </w:rPr>
+      </w:r>
+      <w:r>
+        <w:rPr>
+          <w:highlight w:val="none"/>
+          <w:lang w:val="fr-CH" w:bidi="fr-CH"/>
+        </w:rPr>
+      </w:r>
+      <w:r>
+        <w:rPr>
+          <w:highlight w:val="none"/>
+          <w:lang w:val="fr-CH" w:bidi="fr-CH"/>
+        </w:rPr>
+        <w:t xml:space="preserve">Afin de garantir une interface utilisateur harmonieuse et maintenable, l'ensemble des styles globaux, des ressources visuelles et des thèmes de l'application est centralisé au sein du fichier App.axaml. Cette approche centralisée permet de définir une seule</w:t>
+      </w:r>
+      <w:r>
+        <w:rPr>
+          <w:highlight w:val="none"/>
+          <w:lang w:val="fr-CH" w:bidi="fr-CH"/>
+        </w:rPr>
+        <w:t xml:space="preserve"> fois les polices, les dimensions, les couleurs et les icônes, puis de les réutiliser dans toutes les vues du projet.</w:t>
+      </w:r>
+      <w:r>
+        <w:rPr>
+          <w:highlight w:val="none"/>
+          <w:lang w:val="fr-CH" w:bidi="fr-CH"/>
+        </w:rPr>
+      </w:r>
+      <w:r>
+        <w:rPr>
+          <w:lang w:val="fr-CH"/>
+        </w:rPr>
+      </w:r>
+    </w:p>
+    <w:p>
+      <w:pPr>
+        <w:pStyle w:val="1393"/>
+        <w:pBdr/>
+        <w:spacing/>
+        <w:ind/>
+        <w:rPr>
+          <w:lang w:val="fr-CH"/>
+        </w:rPr>
+      </w:pPr>
+      <w:r>
+        <w:rPr>
+          <w:highlight w:val="none"/>
+          <w:lang w:val="fr-CH" w:bidi="fr-CH"/>
+        </w:rPr>
+      </w:r>
+      <w:r>
+        <w:rPr>
+          <w:highlight w:val="none"/>
+          <w:lang w:val="fr-CH" w:bidi="fr-CH"/>
+        </w:rPr>
+        <w:t xml:space="preserve">3.4.1 </w:t>
+      </w:r>
+      <w:r>
+        <w:rPr>
+          <w:highlight w:val="none"/>
+          <w:lang w:val="fr-CH" w:bidi="fr-CH"/>
+        </w:rPr>
+        <w:t xml:space="preserve">Gestion des Thèmes (Mode Clair / Mode Sombre)</w:t>
+      </w:r>
+      <w:r>
+        <w:rPr>
+          <w:highlight w:val="none"/>
+          <w:lang w:val="fr-CH" w:bidi="fr-CH"/>
+        </w:rPr>
+      </w:r>
+      <w:r>
+        <w:rPr>
+          <w:lang w:val="fr-CH"/>
+        </w:rPr>
+      </w:r>
+    </w:p>
+    <w:p>
+      <w:pPr>
+        <w:pBdr/>
+        <w:spacing/>
+        <w:ind w:firstLine="0" w:left="0"/>
+        <w:rPr>
+          <w:highlight w:val="none"/>
+          <w:lang w:val="fr-CH" w:bidi="fr-CH"/>
+        </w:rPr>
+      </w:pPr>
+      <w:r>
+        <w:rPr>
+          <w:highlight w:val="none"/>
+          <w:lang w:val="fr-CH" w:bidi="fr-CH"/>
+        </w:rPr>
+      </w:r>
+      <w:r>
+        <w:rPr>
+          <w:highlight w:val="none"/>
+          <w:lang w:val="fr-CH" w:bidi="fr-CH"/>
+        </w:rPr>
+      </w:r>
+      <w:r>
+        <w:rPr>
+          <w:highlight w:val="none"/>
+          <w:lang w:val="fr-CH" w:bidi="fr-CH"/>
+        </w:rPr>
+        <w:t xml:space="preserve">L'application intègre nativement une gestion du thème clair et du thème sombre. Les couleurs sont attribuées dynamiquement grâce à l'utilisation de dictionnaires de thèmes (ResourceDictionary.ThemeDictionaries). </w:t>
+      </w:r>
+      <w:r>
+        <w:rPr>
+          <w:highlight w:val="none"/>
+          <w:lang w:val="fr-CH" w:bidi="fr-CH"/>
+        </w:rPr>
+      </w:r>
+    </w:p>
+    <w:p>
+      <w:pPr>
+        <w:pBdr/>
+        <w:spacing/>
+        <w:ind w:firstLine="0" w:left="0"/>
+        <w:rPr>
+          <w:highlight w:val="none"/>
+          <w:lang w:val="fr-CH" w:bidi="fr-CH"/>
+        </w:rPr>
+      </w:pPr>
+      <w:r>
+        <w:rPr>
+          <w:highlight w:val="none"/>
+          <w:lang w:val="fr-CH" w:bidi="fr-CH"/>
+        </w:rPr>
+        <w:t xml:space="preserve">Chaque thème redéfinit un ensemble de variabl</w:t>
+      </w:r>
+      <w:r>
+        <w:rPr>
+          <w:highlight w:val="none"/>
+          <w:lang w:val="fr-CH" w:bidi="fr-CH"/>
+        </w:rPr>
+        <w:t xml:space="preserve">es clés, telles que les couleurs d'arrière-plan (PrimaryBackground, CardBackground), les couleurs de texte (PrimaryForeground, SecondaryForeground) ou encore les couleurs de bordure (CardBorder). Des ajustements spécifiques sont également prévus selon le sy</w:t>
+      </w:r>
+      <w:r>
+        <w:rPr>
+          <w:highlight w:val="none"/>
+          <w:lang w:val="fr-CH" w:bidi="fr-CH"/>
+        </w:rPr>
+        <w:t xml:space="preserve">stème d'exploitation, avec par exemple un arrière-plan dédié pour Linux (PrimaryBackgroundLinux). Enfin, l'icône de la fenêtre de l'application (AppIcon) change dynamiquement pour s'adapter au thème actif.</w:t>
+      </w:r>
+      <w:r>
+        <w:rPr>
+          <w:lang w:val="fr-CH"/>
+        </w:rPr>
+      </w:r>
+      <w:r/>
+    </w:p>
+    <w:p>
+      <w:pPr>
+        <w:pStyle w:val="1393"/>
+        <w:pBdr/>
+        <w:spacing/>
+        <w:ind/>
+        <w:rPr>
+          <w:lang w:val="fr-CH"/>
+        </w:rPr>
+      </w:pPr>
+      <w:r>
+        <w:rPr>
+          <w:highlight w:val="none"/>
+          <w:lang w:val="fr-CH" w:bidi="fr-CH"/>
+        </w:rPr>
+      </w:r>
+      <w:r>
+        <w:rPr>
+          <w:highlight w:val="none"/>
+          <w:lang w:val="fr-CH" w:bidi="fr-CH"/>
+        </w:rPr>
+        <w:t xml:space="preserve">3.4.2 </w:t>
+      </w:r>
+      <w:r>
+        <w:rPr>
+          <w:highlight w:val="none"/>
+          <w:lang w:val="fr-CH" w:bidi="fr-CH"/>
+        </w:rPr>
+        <w:t xml:space="preserve">Typographie et Système d'Icônes</w:t>
+      </w:r>
+      <w:r>
+        <w:rPr>
+          <w:highlight w:val="none"/>
+          <w:lang w:val="fr-CH" w:bidi="fr-CH"/>
+        </w:rPr>
+      </w:r>
+      <w:r>
+        <w:rPr>
+          <w:lang w:val="fr-CH"/>
+        </w:rPr>
+      </w:r>
+    </w:p>
+    <w:p>
+      <w:pPr>
+        <w:pBdr/>
+        <w:spacing/>
+        <w:ind/>
+        <w:rPr>
+          <w:highlight w:val="none"/>
+          <w:lang w:val="fr-CH" w:bidi="fr-CH"/>
+        </w:rPr>
+      </w:pPr>
+      <w:r>
+        <w:rPr>
+          <w:highlight w:val="none"/>
+          <w:lang w:val="fr-CH" w:bidi="fr-CH"/>
+        </w:rPr>
+        <w:t xml:space="preserve">Les polices sont intégrées directement dans l'application et chargées depuis le répertoire local Assets/Fonts. </w:t>
+      </w:r>
+      <w:r>
+        <w:rPr>
+          <w:lang w:val="fr-CH"/>
+        </w:rPr>
+      </w:r>
+    </w:p>
+    <w:p>
+      <w:pPr>
+        <w:pBdr/>
+        <w:spacing/>
+        <w:ind/>
+        <w:rPr>
+          <w:highlight w:val="none"/>
+          <w:lang w:val="fr-CH" w:bidi="fr-CH"/>
+        </w:rPr>
+      </w:pPr>
+      <w:r>
+        <w:rPr>
+          <w:highlight w:val="none"/>
+          <w:lang w:val="fr-CH" w:bidi="fr-CH"/>
+        </w:rPr>
+        <w:t xml:space="preserve">L'interface utilise la police Helvetica pour l'affichage de ses textes. Pour l'iconographie, le projet s'appuie sur la police Phosphor. </w:t>
+      </w:r>
+      <w:r>
+        <w:rPr>
+          <w:lang w:val="fr-CH"/>
+        </w:rPr>
+      </w:r>
+    </w:p>
+    <w:p>
+      <w:pPr>
+        <w:pBdr/>
+        <w:spacing/>
+        <w:ind/>
+        <w:rPr>
+          <w:highlight w:val="none"/>
+        </w:rPr>
+      </w:pPr>
+      <w:r>
+        <w:rPr>
+          <w:highlight w:val="none"/>
+          <w:lang w:val="fr-CH" w:bidi="fr-CH"/>
+        </w:rPr>
+        <w:t xml:space="preserve">Les icônes</w:t>
+      </w:r>
+      <w:r>
+        <w:rPr>
+          <w:highlight w:val="none"/>
+          <w:lang w:val="fr-CH" w:bidi="fr-CH"/>
+        </w:rPr>
+        <w:t xml:space="preserve"> affichées (comme la maison, l'engrenage, le disque dur, ou le soleil et la lune) ne sont pas des images classiques, mais des caractères Unicode spécifiques interprétés par cette police.</w:t>
+      </w:r>
+      <w:r>
+        <w:rPr>
+          <w:lang w:val="fr-CH"/>
+        </w:rPr>
+      </w:r>
+      <w:r>
+        <w:rPr>
+          <w:highlight w:val="none"/>
+          <w:lang w:val="fr-CH" w:bidi="fr-CH"/>
+        </w:rPr>
+        <w:t xml:space="preserve">Cette méthode technique garantit un rendu vectoriel net à n'importe qu</w:t>
+      </w:r>
+      <w:r>
+        <w:rPr>
+          <w:highlight w:val="none"/>
+          <w:lang w:val="fr-CH" w:bidi="fr-CH"/>
+        </w:rPr>
+        <w:t xml:space="preserve">elle échelle et simplifie la modification des couleurs lors des changements de thème.</w:t>
+      </w:r>
+      <w:r/>
+      <w:r/>
+      <w:r>
+        <w:rPr>
+          <w:highlight w:val="none"/>
+          <w:lang w:val="fr-CH" w:bidi="fr-CH"/>
+        </w:rPr>
+      </w:r>
+    </w:p>
+    <w:p>
+      <w:pPr>
+        <w:pStyle w:val="1393"/>
+        <w:pBdr/>
+        <w:spacing/>
+        <w:ind/>
+        <w:rPr>
+          <w:highlight w:val="none"/>
+          <w:lang w:val="fr-CH" w:bidi="fr-CH"/>
+        </w:rPr>
+      </w:pPr>
+      <w:r>
+        <w:rPr>
+          <w:highlight w:val="none"/>
+          <w:lang w:val="fr-CH" w:bidi="fr-CH"/>
+        </w:rPr>
+        <w:t xml:space="preserve">3.4.3 </w:t>
+      </w:r>
+      <w:r>
+        <w:rPr>
+          <w:highlight w:val="none"/>
+          <w:lang w:val="fr-CH" w:bidi="fr-CH"/>
+        </w:rPr>
+        <w:t xml:space="preserve">Cohérence Visuelle et Dimensions</w:t>
+      </w:r>
+      <w:r>
+        <w:rPr>
+          <w:highlight w:val="none"/>
+          <w:lang w:val="fr-CH" w:bidi="fr-CH"/>
+        </w:rPr>
+      </w:r>
+      <w:r>
+        <w:rPr>
+          <w:highlight w:val="none"/>
+          <w:lang w:val="fr-CH" w:bidi="fr-CH"/>
+        </w:rPr>
+      </w:r>
+    </w:p>
+    <w:p>
+      <w:pPr>
+        <w:pBdr/>
+        <w:spacing/>
+        <w:ind/>
+        <w:rPr>
+          <w:highlight w:val="none"/>
+          <w:lang w:val="fr-CH" w:bidi="fr-CH"/>
+        </w:rPr>
+      </w:pPr>
+      <w:r>
+        <w:rPr>
+          <w:highlight w:val="none"/>
+          <w:lang w:val="fr-CH" w:bidi="fr-CH"/>
+        </w:rPr>
+      </w:r>
+      <w:r>
+        <w:rPr>
+          <w:highlight w:val="none"/>
+          <w:lang w:val="fr-CH" w:bidi="fr-CH"/>
+        </w:rPr>
+      </w:r>
+      <w:r>
+        <w:rPr>
+          <w:highlight w:val="none"/>
+          <w:lang w:val="fr-CH" w:bidi="fr-CH"/>
+        </w:rPr>
+        <w:t xml:space="preserve">Pour éviter les valeurs "en dur" dispersées dans le code des différentes pages, des constantes structurelles ont été définies globalement. Des variables standardisées (Small, Normal, Medium, Large, Logo) régissent l'échelle typographique et la taille des él</w:t>
+      </w:r>
+      <w:r>
+        <w:rPr>
+          <w:highlight w:val="none"/>
+          <w:lang w:val="fr-CH" w:bidi="fr-CH"/>
+        </w:rPr>
+        <w:t xml:space="preserve">éments visuels de manière uniforme.</w:t>
+      </w:r>
+      <w:r>
+        <w:rPr>
+          <w:lang w:val="fr-CH" w:bidi="fr-CH"/>
+        </w:rPr>
+      </w:r>
+    </w:p>
+    <w:p>
+      <w:pPr>
+        <w:pBdr/>
+        <w:spacing/>
+        <w:ind/>
+        <w:rPr>
+          <w:lang w:val="fr-CH" w:bidi="fr-CH"/>
+        </w:rPr>
+      </w:pPr>
+      <w:r>
+        <w:rPr>
+          <w:highlight w:val="none"/>
+          <w:lang w:val="fr-CH" w:bidi="fr-CH"/>
+        </w:rPr>
+        <w:t xml:space="preserve">La courbure des éléments de l'interface est également uniformisée grâce aux ressources CardCornerRadius et FieldCornerRadius, assurant un design cohérent entre les conteneurs principaux et les champs de saisie. De plus, l</w:t>
+      </w:r>
+      <w:r>
+        <w:rPr>
+          <w:highlight w:val="none"/>
+          <w:lang w:val="fr-CH" w:bidi="fr-CH"/>
+        </w:rPr>
+        <w:t xml:space="preserve">es couleurs d'état, comme ErrorForeground (définie en rouge pour signaler une erreur), sont stockées dans ce même dictionnaire pour garantir un retour visuel constant à l'utilisateur.</w:t>
+      </w:r>
+      <w:r>
+        <w:rPr>
+          <w:lang w:val="fr-CH"/>
+        </w:rPr>
+      </w:r>
+      <w:r/>
     </w:p>
     <w:sectPr>
       <w:headerReference w:type="default" r:id="rId14"/>
@@ -13594,7 +14350,7 @@
                 <w:szCs w:val="24"/>
                 <w:lang w:val="fr-CH"/>
               </w:rPr>
-              <w:t xml:space="preserve">06.03.26</w:t>
+              <w:t xml:space="preserve">10.03.26</w:t>
             </w:r>
             <w:r>
               <w:rPr>
@@ -13838,7 +14594,7 @@
                 <w:szCs w:val="24"/>
                 <w:lang w:val="fr-CH"/>
               </w:rPr>
-              <w:t xml:space="preserve">06.03.26</w:t>
+              <w:t xml:space="preserve">10.03.26</w:t>
             </w:r>
             <w:r>
               <w:rPr>
@@ -14085,7 +14841,7 @@
                 <w:szCs w:val="24"/>
                 <w:lang w:val="fr-CH"/>
               </w:rPr>
-              <w:t xml:space="preserve">06.03.26</w:t>
+              <w:t xml:space="preserve">10.03.26</w:t>
             </w:r>
             <w:r>
               <w:rPr>
@@ -14328,7 +15084,7 @@
                 <w:szCs w:val="24"/>
                 <w:lang w:val="fr-CH"/>
               </w:rPr>
-              <w:t xml:space="preserve">06.03.26</w:t>
+              <w:t xml:space="preserve">10.03.26</w:t>
             </w:r>
             <w:r>
               <w:rPr>
@@ -14562,7 +15318,7 @@
                 <w:szCs w:val="24"/>
                 <w:lang w:val="fr-CH"/>
               </w:rPr>
-              <w:t xml:space="preserve">06.03.26</w:t>
+              <w:t xml:space="preserve">10.03.26</w:t>
             </w:r>
             <w:r>
               <w:rPr>
@@ -14796,7 +15552,7 @@
                 <w:szCs w:val="24"/>
                 <w:lang w:val="fr-CH"/>
               </w:rPr>
-              <w:t xml:space="preserve">06.03.26</w:t>
+              <w:t xml:space="preserve">10.03.26</w:t>
             </w:r>
             <w:r>
               <w:rPr>
@@ -27020,6 +27776,282 @@
         <w:pBdr/>
         <w:spacing/>
         <w:ind w:hanging="360" w:left="6469"/>
+      </w:pPr>
+      <w:rPr>
+        <w:rFonts w:hint="default" w:ascii="Wingdings" w:hAnsi="Wingdings" w:eastAsia="Wingdings" w:cs="Wingdings"/>
+      </w:rPr>
+      <w:start w:val="1"/>
+      <w:suff w:val="tab"/>
+    </w:lvl>
+  </w:abstractNum>
+  <w:abstractNum w:abstractNumId="80">
+    <w:nsid w:val="03825ECA"/>
+    <w:lvl w:ilvl="0">
+      <w:isLgl w:val="false"/>
+      <w:lvlJc w:val="left"/>
+      <w:lvlText w:val="%1."/>
+      <w:numFmt w:val="decimal"/>
+      <w:pPr>
+        <w:pBdr/>
+        <w:spacing/>
+        <w:ind w:hanging="360" w:left="709"/>
+      </w:pPr>
+      <w:rPr/>
+      <w:start w:val="1"/>
+      <w:suff w:val="tab"/>
+    </w:lvl>
+    <w:lvl w:ilvl="1">
+      <w:isLgl w:val="false"/>
+      <w:lvlJc w:val="left"/>
+      <w:lvlText w:val="%2."/>
+      <w:numFmt w:val="lowerLetter"/>
+      <w:pPr>
+        <w:pBdr/>
+        <w:spacing/>
+        <w:ind w:hanging="360" w:left="1429"/>
+      </w:pPr>
+      <w:rPr/>
+      <w:start w:val="1"/>
+      <w:suff w:val="tab"/>
+    </w:lvl>
+    <w:lvl w:ilvl="2">
+      <w:isLgl w:val="false"/>
+      <w:lvlJc w:val="right"/>
+      <w:lvlText w:val="%3."/>
+      <w:numFmt w:val="lowerRoman"/>
+      <w:pPr>
+        <w:pBdr/>
+        <w:spacing/>
+        <w:ind w:hanging="180" w:left="2149"/>
+      </w:pPr>
+      <w:rPr/>
+      <w:start w:val="1"/>
+      <w:suff w:val="tab"/>
+    </w:lvl>
+    <w:lvl w:ilvl="3">
+      <w:isLgl w:val="false"/>
+      <w:lvlJc w:val="left"/>
+      <w:lvlText w:val="%4."/>
+      <w:numFmt w:val="decimal"/>
+      <w:pPr>
+        <w:pBdr/>
+        <w:spacing/>
+        <w:ind w:hanging="360" w:left="2869"/>
+      </w:pPr>
+      <w:rPr/>
+      <w:start w:val="1"/>
+      <w:suff w:val="tab"/>
+    </w:lvl>
+    <w:lvl w:ilvl="4">
+      <w:isLgl w:val="false"/>
+      <w:lvlJc w:val="left"/>
+      <w:lvlText w:val="%5."/>
+      <w:numFmt w:val="lowerLetter"/>
+      <w:pPr>
+        <w:pBdr/>
+        <w:spacing/>
+        <w:ind w:hanging="360" w:left="3589"/>
+      </w:pPr>
+      <w:rPr/>
+      <w:start w:val="1"/>
+      <w:suff w:val="tab"/>
+    </w:lvl>
+    <w:lvl w:ilvl="5">
+      <w:isLgl w:val="false"/>
+      <w:lvlJc w:val="right"/>
+      <w:lvlText w:val="%6."/>
+      <w:numFmt w:val="lowerRoman"/>
+      <w:pPr>
+        <w:pBdr/>
+        <w:spacing/>
+        <w:ind w:hanging="180" w:left="4309"/>
+      </w:pPr>
+      <w:rPr/>
+      <w:start w:val="1"/>
+      <w:suff w:val="tab"/>
+    </w:lvl>
+    <w:lvl w:ilvl="6">
+      <w:isLgl w:val="false"/>
+      <w:lvlJc w:val="left"/>
+      <w:lvlText w:val="%7."/>
+      <w:numFmt w:val="decimal"/>
+      <w:pPr>
+        <w:pBdr/>
+        <w:spacing/>
+        <w:ind w:hanging="360" w:left="5029"/>
+      </w:pPr>
+      <w:rPr/>
+      <w:start w:val="1"/>
+      <w:suff w:val="tab"/>
+    </w:lvl>
+    <w:lvl w:ilvl="7">
+      <w:isLgl w:val="false"/>
+      <w:lvlJc w:val="left"/>
+      <w:lvlText w:val="%8."/>
+      <w:numFmt w:val="lowerLetter"/>
+      <w:pPr>
+        <w:pBdr/>
+        <w:spacing/>
+        <w:ind w:hanging="360" w:left="5749"/>
+      </w:pPr>
+      <w:rPr/>
+      <w:start w:val="1"/>
+      <w:suff w:val="tab"/>
+    </w:lvl>
+    <w:lvl w:ilvl="8">
+      <w:isLgl w:val="false"/>
+      <w:lvlJc w:val="right"/>
+      <w:lvlText w:val="%9."/>
+      <w:numFmt w:val="lowerRoman"/>
+      <w:pPr>
+        <w:pBdr/>
+        <w:spacing/>
+        <w:ind w:hanging="180" w:left="6469"/>
+      </w:pPr>
+      <w:rPr/>
+      <w:start w:val="1"/>
+      <w:suff w:val="tab"/>
+    </w:lvl>
+  </w:abstractNum>
+  <w:abstractNum w:abstractNumId="81">
+    <w:nsid w:val="48A771E3"/>
+    <w:lvl w:ilvl="0">
+      <w:isLgl w:val="false"/>
+      <w:lvlJc w:val="left"/>
+      <w:lvlText w:val="·"/>
+      <w:numFmt w:val="bullet"/>
+      <w:pPr>
+        <w:pBdr/>
+        <w:spacing/>
+        <w:ind w:hanging="360" w:left="720"/>
+      </w:pPr>
+      <w:rPr>
+        <w:rFonts w:hint="default" w:ascii="Symbol" w:hAnsi="Symbol" w:eastAsia="Symbol" w:cs="Symbol"/>
+      </w:rPr>
+      <w:start w:val="1"/>
+      <w:suff w:val="tab"/>
+    </w:lvl>
+    <w:lvl w:ilvl="1">
+      <w:isLgl w:val="false"/>
+      <w:lvlJc w:val="left"/>
+      <w:lvlText w:val="o"/>
+      <w:numFmt w:val="bullet"/>
+      <w:pPr>
+        <w:pBdr/>
+        <w:spacing/>
+        <w:ind w:hanging="360" w:left="1440"/>
+      </w:pPr>
+      <w:rPr>
+        <w:rFonts w:hint="default" w:ascii="Courier New" w:hAnsi="Courier New" w:eastAsia="Courier New" w:cs="Courier New"/>
+      </w:rPr>
+      <w:start w:val="1"/>
+      <w:suff w:val="tab"/>
+    </w:lvl>
+    <w:lvl w:ilvl="2">
+      <w:isLgl w:val="false"/>
+      <w:lvlJc w:val="left"/>
+      <w:lvlText w:val="§"/>
+      <w:numFmt w:val="bullet"/>
+      <w:pPr>
+        <w:pBdr/>
+        <w:spacing/>
+        <w:ind w:hanging="360" w:left="2160"/>
+      </w:pPr>
+      <w:rPr>
+        <w:rFonts w:hint="default" w:ascii="Wingdings" w:hAnsi="Wingdings" w:eastAsia="Wingdings" w:cs="Wingdings"/>
+      </w:rPr>
+      <w:start w:val="1"/>
+      <w:suff w:val="tab"/>
+    </w:lvl>
+    <w:lvl w:ilvl="3">
+      <w:isLgl w:val="false"/>
+      <w:lvlJc w:val="left"/>
+      <w:lvlText w:val="·"/>
+      <w:numFmt w:val="bullet"/>
+      <w:pPr>
+        <w:pBdr/>
+        <w:spacing/>
+        <w:ind w:hanging="360" w:left="2880"/>
+      </w:pPr>
+      <w:rPr>
+        <w:rFonts w:hint="default" w:ascii="Symbol" w:hAnsi="Symbol" w:eastAsia="Symbol" w:cs="Symbol"/>
+      </w:rPr>
+      <w:start w:val="1"/>
+      <w:suff w:val="tab"/>
+    </w:lvl>
+    <w:lvl w:ilvl="4">
+      <w:isLgl w:val="false"/>
+      <w:lvlJc w:val="left"/>
+      <w:lvlText w:val="o"/>
+      <w:numFmt w:val="bullet"/>
+      <w:pPr>
+        <w:pBdr/>
+        <w:spacing/>
+        <w:ind w:hanging="360" w:left="3600"/>
+      </w:pPr>
+      <w:rPr>
+        <w:rFonts w:hint="default" w:ascii="Courier New" w:hAnsi="Courier New" w:eastAsia="Courier New" w:cs="Courier New"/>
+      </w:rPr>
+      <w:start w:val="1"/>
+      <w:suff w:val="tab"/>
+    </w:lvl>
+    <w:lvl w:ilvl="5">
+      <w:isLgl w:val="false"/>
+      <w:lvlJc w:val="left"/>
+      <w:lvlText w:val="§"/>
+      <w:numFmt w:val="bullet"/>
+      <w:pPr>
+        <w:pBdr/>
+        <w:spacing/>
+        <w:ind w:hanging="360" w:left="4320"/>
+      </w:pPr>
+      <w:rPr>
+        <w:rFonts w:hint="default" w:ascii="Wingdings" w:hAnsi="Wingdings" w:eastAsia="Wingdings" w:cs="Wingdings"/>
+      </w:rPr>
+      <w:start w:val="1"/>
+      <w:suff w:val="tab"/>
+    </w:lvl>
+    <w:lvl w:ilvl="6">
+      <w:isLgl w:val="false"/>
+      <w:lvlJc w:val="left"/>
+      <w:lvlText w:val="·"/>
+      <w:numFmt w:val="bullet"/>
+      <w:pPr>
+        <w:pBdr/>
+        <w:spacing/>
+        <w:ind w:hanging="360" w:left="5040"/>
+      </w:pPr>
+      <w:rPr>
+        <w:rFonts w:hint="default" w:ascii="Symbol" w:hAnsi="Symbol" w:eastAsia="Symbol" w:cs="Symbol"/>
+      </w:rPr>
+      <w:start w:val="1"/>
+      <w:suff w:val="tab"/>
+    </w:lvl>
+    <w:lvl w:ilvl="7">
+      <w:isLgl w:val="false"/>
+      <w:lvlJc w:val="left"/>
+      <w:lvlText w:val="o"/>
+      <w:numFmt w:val="bullet"/>
+      <w:pPr>
+        <w:pBdr/>
+        <w:spacing/>
+        <w:ind w:hanging="360" w:left="5760"/>
+      </w:pPr>
+      <w:rPr>
+        <w:rFonts w:hint="default" w:ascii="Courier New" w:hAnsi="Courier New" w:eastAsia="Courier New" w:cs="Courier New"/>
+      </w:rPr>
+      <w:start w:val="1"/>
+      <w:suff w:val="tab"/>
+    </w:lvl>
+    <w:lvl w:ilvl="8">
+      <w:isLgl w:val="false"/>
+      <w:lvlJc w:val="left"/>
+      <w:lvlText w:val="§"/>
+      <w:numFmt w:val="bullet"/>
+      <w:pPr>
+        <w:pBdr/>
+        <w:spacing/>
+        <w:ind w:hanging="360" w:left="6480"/>
       </w:pPr>
       <w:rPr>
         <w:rFonts w:hint="default" w:ascii="Wingdings" w:hAnsi="Wingdings" w:eastAsia="Wingdings" w:cs="Wingdings"/>
@@ -27291,6 +28323,12 @@
   </w:num>
   <w:num w:numId="88">
     <w:abstractNumId w:val="79"/>
+  </w:num>
+  <w:num w:numId="89">
+    <w:abstractNumId w:val="80"/>
+  </w:num>
+  <w:num w:numId="90">
+    <w:abstractNumId w:val="81"/>
   </w:num>
 </w:numbering>
 </file>

</xml_diff>

<commit_message>
Documentation du code model.cs + correction de la documention et maj journal de travail
</commit_message>
<xml_diff>
--- a/Documentation/LHO - M5 - DT.docx
+++ b/Documentation/LHO - M5 - DT.docx
@@ -1899,7 +1899,6 @@
           <w:r>
             <w:rPr>
               <w:highlight w:val="none"/>
-              <w:lang w:val="fr-CH" w:bidi="fr-CH"/>
             </w:rPr>
           </w:r>
           <w:r>
@@ -1957,7 +1956,6 @@
           <w:r>
             <w:rPr>
               <w:highlight w:val="none"/>
-              <w:lang w:val="fr-CH" w:bidi="fr-CH"/>
             </w:rPr>
           </w:r>
           <w:r>
@@ -2298,7 +2296,6 @@
           <w:r>
             <w:rPr>
               <w:highlight w:val="none"/>
-              <w:lang w:val="fr-CH"/>
             </w:rPr>
           </w:r>
           <w:r>
@@ -2816,7 +2813,6 @@
           <w:r>
             <w:rPr>
               <w:highlight w:val="none"/>
-              <w:lang w:val="fr-CH" w:bidi="fr-CH"/>
             </w:rPr>
           </w:r>
           <w:r>
@@ -6334,6 +6330,7 @@
           <w:lang w:val="fr-CH"/>
         </w:rPr>
       </w:r>
+      <w:r/>
       <w:r>
         <mc:AlternateContent>
           <mc:Choice Requires="wpg">
@@ -6349,7 +6346,7 @@
                   <a:graphicData uri="http://schemas.openxmlformats.org/drawingml/2006/picture">
                     <pic:pic xmlns:pic="http://schemas.openxmlformats.org/drawingml/2006/picture">
                       <pic:nvPicPr>
-                        <pic:cNvPr id="1531504428" name="" descr="CREATE TABLE type_travail(&#10;   typ_id INTEGER,&#10;   typ_nom TEXT NOT NULL,&#10;   PRIMARY KEY(typ_id),&#10;   UNIQUE(typ_nom)&#10;);&#10;&#10;CREATE TABLE module_groupe(&#10;   mod_id INTEGER,&#10;   mod_nom TEXT NOT NULL,&#10;   PRIMARY KEY(mod_id),&#10;   UNIQUE(mod_nom)&#10;);&#10;&#10;CREATE TABLE entree(&#10;   ent_id INTEGER,&#10;   ent_duree NUMERIC(6,4)   NOT NULL,&#10;   ent_description TEXT NOT NULL,&#10;   ent_date NUMERIC NOT NULL,&#10;   mod_id INTEGER NOT NULL,&#10;   typ_id INTEGER NOT NULL,&#10;   PRIMARY KEY(ent_id),&#10;   FOREIGN KEY(mod_id) REFERENCES module_groupe(mod_id),&#10;   FOREIGN KEY(typ_id) REFERENCES type_travail(typ_id)&#10;);&#10;&#10;CREATE TABLE branche(&#10;   bra_id INTEGER,&#10;   bra_nom TEXT NOT NULL,&#10;   mod_id INTEGER NOT NULL,&#10;   PRIMARY KEY(bra_id),&#10;   FOREIGN KEY(mod_id) REFERENCES module_groupe(mod_id)&#10;);&#10;&#10;CREATE TABLE note(&#10;   not_id INTEGER,&#10;   not_date NUMERIC NOT NULL,&#10;   not_description TEXT NOT NULL,&#10;   not_valeur NUMERIC(2,1)   NOT NULL,&#10;   bra_id INTEGER NOT NULL,&#10;   PRIMARY KEY(not_id),&#10;   FOREIGN KEY(bra_id) REFERENCES branche(bra_id)&#10;);&#10;" title="Code SQL (Généré par le logiciel Looping)"/>
+                        <pic:cNvPr id="673519280" name="" descr="CREATE TABLE type_travail(&#10;   typ_id INTEGER,&#10;   typ_nom TEXT NOT NULL,&#10;   PRIMARY KEY(typ_id),&#10;   UNIQUE(typ_nom)&#10;);&#10;&#10;CREATE TABLE module_groupe(&#10;   mod_id INTEGER,&#10;   mod_nom TEXT NOT NULL,&#10;   PRIMARY KEY(mod_id),&#10;   UNIQUE(mod_nom)&#10;);&#10;&#10;CREATE TABLE entree(&#10;   ent_id INTEGER,&#10;   ent_duree NUMERIC(6,4)   NOT NULL,&#10;   ent_description TEXT NOT NULL,&#10;   ent_date NUMERIC NOT NULL,&#10;   mod_id INTEGER NOT NULL,&#10;   typ_id INTEGER NOT NULL,&#10;   PRIMARY KEY(ent_id),&#10;   FOREIGN KEY(mod_id) REFERENCES module_groupe(mod_id),&#10;   FOREIGN KEY(typ_id) REFERENCES type_travail(typ_id)&#10;);&#10;&#10;CREATE TABLE branche(&#10;   bra_id INTEGER,&#10;   bra_nom TEXT NOT NULL,&#10;   mod_id INTEGER NOT NULL,&#10;   PRIMARY KEY(bra_id),&#10;   FOREIGN KEY(mod_id) REFERENCES module_groupe(mod_id)&#10;);&#10;&#10;CREATE TABLE note(&#10;   not_id INTEGER,&#10;   not_date NUMERIC NOT NULL,&#10;   not_description TEXT NOT NULL,&#10;   not_valeur NUMERIC(2,1)   NOT NULL,&#10;   bra_id INTEGER NOT NULL,&#10;   PRIMARY KEY(not_id),&#10;   FOREIGN KEY(bra_id) REFERENCES branche(bra_id)&#10;);&#10;" title="Code SQL (Généré par le logiciel Looping)"/>
                         <pic:cNvPicPr>
                           <a:picLocks noChangeAspect="1"/>
                         </pic:cNvPicPr>
@@ -6361,7 +6358,7 @@
                       <pic:spPr bwMode="auto">
                         <a:xfrm rot="0" flipH="0" flipV="0">
                           <a:off x="0" y="0"/>
-                          <a:ext cx="5760084" cy="2161800"/>
+                          <a:ext cx="5760083" cy="2161800"/>
                         </a:xfrm>
                         <a:prstGeom prst="rect">
                           <a:avLst/>
@@ -6402,6 +6399,7 @@
           </mc:Fallback>
         </mc:AlternateContent>
       </w:r>
+      <w:r/>
       <w:r>
         <w:rPr>
           <w:highlight w:val="none"/>
@@ -6489,7 +6487,7 @@
             </w:r>
             <w:r>
               <w:rPr>
-                <w:rFonts w:ascii="Calibri" w:hAnsi="Calibri" w:eastAsia="Calibri" w:cs="Calibri"/>
+                <w:rFonts w:ascii="Calibri" w:hAnsi="Calibri" w:cs="Calibri"/>
                 <w:color w:val="ffffff" w:themeColor="background1"/>
                 <w:sz w:val="22"/>
                 <w:szCs w:val="22"/>
@@ -6536,7 +6534,7 @@
             </w:r>
             <w:r>
               <w:rPr>
-                <w:rFonts w:ascii="Calibri" w:hAnsi="Calibri" w:eastAsia="Calibri" w:cs="Calibri"/>
+                <w:rFonts w:ascii="Calibri" w:hAnsi="Calibri" w:cs="Calibri"/>
                 <w:color w:val="ffffff" w:themeColor="background1"/>
                 <w:sz w:val="22"/>
                 <w:szCs w:val="22"/>
@@ -6583,7 +6581,7 @@
             </w:r>
             <w:r>
               <w:rPr>
-                <w:rFonts w:ascii="Calibri" w:hAnsi="Calibri" w:eastAsia="Calibri" w:cs="Calibri"/>
+                <w:rFonts w:ascii="Calibri" w:hAnsi="Calibri" w:cs="Calibri"/>
                 <w:color w:val="ffffff" w:themeColor="background1"/>
                 <w:sz w:val="22"/>
                 <w:szCs w:val="22"/>
@@ -6630,7 +6628,7 @@
             </w:r>
             <w:r>
               <w:rPr>
-                <w:rFonts w:ascii="Calibri" w:hAnsi="Calibri" w:eastAsia="Calibri" w:cs="Calibri"/>
+                <w:rFonts w:ascii="Calibri" w:hAnsi="Calibri" w:cs="Calibri"/>
                 <w:color w:val="ffffff" w:themeColor="background1"/>
                 <w:sz w:val="22"/>
                 <w:szCs w:val="22"/>
@@ -6735,7 +6733,7 @@
             </w:r>
             <w:r>
               <w:rPr>
-                <w:rFonts w:ascii="Calibri" w:hAnsi="Calibri" w:eastAsia="Calibri" w:cs="Calibri"/>
+                <w:rFonts w:ascii="Calibri" w:hAnsi="Calibri" w:cs="Calibri"/>
                 <w:sz w:val="22"/>
                 <w:szCs w:val="22"/>
               </w:rPr>
@@ -6778,7 +6776,7 @@
             </w:r>
             <w:r>
               <w:rPr>
-                <w:rFonts w:ascii="Calibri" w:hAnsi="Calibri" w:eastAsia="Calibri" w:cs="Calibri"/>
+                <w:rFonts w:ascii="Calibri" w:hAnsi="Calibri" w:cs="Calibri"/>
                 <w:sz w:val="22"/>
                 <w:szCs w:val="22"/>
               </w:rPr>
@@ -6821,7 +6819,7 @@
             </w:r>
             <w:r>
               <w:rPr>
-                <w:rFonts w:ascii="Calibri" w:hAnsi="Calibri" w:eastAsia="Calibri" w:cs="Calibri"/>
+                <w:rFonts w:ascii="Calibri" w:hAnsi="Calibri" w:cs="Calibri"/>
                 <w:sz w:val="22"/>
                 <w:szCs w:val="22"/>
               </w:rPr>
@@ -6885,7 +6883,7 @@
             </w:r>
             <w:r>
               <w:rPr>
-                <w:rFonts w:ascii="Calibri" w:hAnsi="Calibri" w:eastAsia="Calibri" w:cs="Calibri"/>
+                <w:rFonts w:ascii="Calibri" w:hAnsi="Calibri" w:cs="Calibri"/>
                 <w:sz w:val="22"/>
                 <w:szCs w:val="22"/>
               </w:rPr>
@@ -6928,7 +6926,7 @@
             </w:r>
             <w:r>
               <w:rPr>
-                <w:rFonts w:ascii="Calibri" w:hAnsi="Calibri" w:eastAsia="Calibri" w:cs="Calibri"/>
+                <w:rFonts w:ascii="Calibri" w:hAnsi="Calibri" w:cs="Calibri"/>
                 <w:sz w:val="22"/>
                 <w:szCs w:val="22"/>
               </w:rPr>
@@ -6971,7 +6969,7 @@
             </w:r>
             <w:r>
               <w:rPr>
-                <w:rFonts w:ascii="Calibri" w:hAnsi="Calibri" w:eastAsia="Calibri" w:cs="Calibri"/>
+                <w:rFonts w:ascii="Calibri" w:hAnsi="Calibri" w:cs="Calibri"/>
                 <w:sz w:val="22"/>
                 <w:szCs w:val="22"/>
               </w:rPr>
@@ -7033,6 +7031,16 @@
                 <w:szCs w:val="22"/>
               </w:rPr>
             </w:r>
+            <w:r/>
+            <w:r/>
+            <w:r>
+              <w:rPr>
+                <w:rFonts w:ascii="Calibri" w:hAnsi="Calibri" w:cs="Calibri"/>
+                <w:color w:val="ffffff" w:themeColor="background1"/>
+                <w:sz w:val="22"/>
+                <w:szCs w:val="22"/>
+              </w:rPr>
+            </w:r>
           </w:p>
         </w:tc>
         <w:tc>
@@ -7074,7 +7082,7 @@
             </w:r>
             <w:r>
               <w:rPr>
-                <w:rFonts w:ascii="Calibri" w:hAnsi="Calibri" w:eastAsia="Calibri" w:cs="Calibri"/>
+                <w:rFonts w:ascii="Calibri" w:hAnsi="Calibri" w:cs="Calibri"/>
                 <w:sz w:val="22"/>
                 <w:szCs w:val="22"/>
               </w:rPr>
@@ -7117,7 +7125,7 @@
             </w:r>
             <w:r>
               <w:rPr>
-                <w:rFonts w:ascii="Calibri" w:hAnsi="Calibri" w:eastAsia="Calibri" w:cs="Calibri"/>
+                <w:rFonts w:ascii="Calibri" w:hAnsi="Calibri" w:cs="Calibri"/>
                 <w:sz w:val="22"/>
                 <w:szCs w:val="22"/>
               </w:rPr>
@@ -7160,7 +7168,7 @@
             </w:r>
             <w:r>
               <w:rPr>
-                <w:rFonts w:ascii="Calibri" w:hAnsi="Calibri" w:eastAsia="Calibri" w:cs="Calibri"/>
+                <w:rFonts w:ascii="Calibri" w:hAnsi="Calibri" w:cs="Calibri"/>
                 <w:sz w:val="22"/>
                 <w:szCs w:val="22"/>
               </w:rPr>
@@ -7224,7 +7232,7 @@
             </w:r>
             <w:r>
               <w:rPr>
-                <w:rFonts w:ascii="Calibri" w:hAnsi="Calibri" w:eastAsia="Calibri" w:cs="Calibri"/>
+                <w:rFonts w:ascii="Calibri" w:hAnsi="Calibri" w:cs="Calibri"/>
                 <w:sz w:val="22"/>
                 <w:szCs w:val="22"/>
               </w:rPr>
@@ -7267,7 +7275,7 @@
             </w:r>
             <w:r>
               <w:rPr>
-                <w:rFonts w:ascii="Calibri" w:hAnsi="Calibri" w:eastAsia="Calibri" w:cs="Calibri"/>
+                <w:rFonts w:ascii="Calibri" w:hAnsi="Calibri" w:cs="Calibri"/>
                 <w:sz w:val="22"/>
                 <w:szCs w:val="22"/>
               </w:rPr>
@@ -7310,7 +7318,7 @@
             </w:r>
             <w:r>
               <w:rPr>
-                <w:rFonts w:ascii="Calibri" w:hAnsi="Calibri" w:eastAsia="Calibri" w:cs="Calibri"/>
+                <w:rFonts w:ascii="Calibri" w:hAnsi="Calibri" w:cs="Calibri"/>
                 <w:sz w:val="22"/>
                 <w:szCs w:val="22"/>
               </w:rPr>
@@ -7318,6 +7326,204 @@
             <w:r>
               <w:rPr>
                 <w:rFonts w:ascii="Calibri" w:hAnsi="Calibri" w:cs="Calibri"/>
+                <w:sz w:val="22"/>
+                <w:szCs w:val="22"/>
+              </w:rPr>
+            </w:r>
+          </w:p>
+        </w:tc>
+      </w:tr>
+      <w:tr>
+        <w:trPr/>
+        <w:tc>
+          <w:tcPr>
+            <w:tcBorders/>
+            <w:tcW w:w="1800" w:type="dxa"/>
+            <w:vAlign w:val="center"/>
+            <w:vMerge w:val="continue"/>
+          </w:tcPr>
+          <w:p>
+            <w:pPr>
+              <w:pBdr/>
+              <w:spacing/>
+              <w:ind/>
+              <w:rPr/>
+            </w:pPr>
+            <w:r/>
+            <w:r/>
+          </w:p>
+        </w:tc>
+        <w:tc>
+          <w:tcPr>
+            <w:tcBorders/>
+            <w:tcW w:w="1628" w:type="dxa"/>
+            <w:vAlign w:val="center"/>
+            <w:vMerge w:val="restart"/>
+          </w:tcPr>
+          <w:p>
+            <w:pPr>
+              <w:pBdr/>
+              <w:spacing w:after="0" w:before="0" w:line="240" w:lineRule="auto"/>
+              <w:ind/>
+              <w:jc w:val="left"/>
+              <w:rPr>
+                <w:rFonts w:ascii="Calibri" w:hAnsi="Calibri" w:eastAsia="Calibri" w:cs="Calibri"/>
+                <w:color w:val="1f1f1f"/>
+                <w:sz w:val="22"/>
+                <w:szCs w:val="22"/>
+              </w:rPr>
+            </w:pPr>
+            <w:r>
+              <w:rPr>
+                <w:rFonts w:ascii="Calibri" w:hAnsi="Calibri" w:eastAsia="Calibri" w:cs="Calibri"/>
+                <w:color w:val="1f1f1f"/>
+                <w:sz w:val="22"/>
+                <w:szCs w:val="22"/>
+              </w:rPr>
+            </w:r>
+            <w:r>
+              <w:t xml:space="preserve">bra_type</w:t>
+            </w:r>
+            <w:r>
+              <w:rPr>
+                <w:rFonts w:ascii="Calibri" w:hAnsi="Calibri" w:eastAsia="Calibri" w:cs="Calibri"/>
+                <w:color w:val="1f1f1f"/>
+                <w:sz w:val="22"/>
+                <w:szCs w:val="22"/>
+              </w:rPr>
+            </w:r>
+            <w:r>
+              <w:rPr>
+                <w:rFonts w:ascii="Calibri" w:hAnsi="Calibri" w:eastAsia="Calibri" w:cs="Calibri"/>
+                <w:color w:val="1f1f1f"/>
+                <w:sz w:val="22"/>
+                <w:szCs w:val="22"/>
+              </w:rPr>
+            </w:r>
+            <w:r>
+              <w:rPr>
+                <w:rFonts w:ascii="Calibri" w:hAnsi="Calibri" w:eastAsia="Calibri" w:cs="Calibri"/>
+                <w:color w:val="1f1f1f"/>
+                <w:sz w:val="22"/>
+                <w:szCs w:val="22"/>
+              </w:rPr>
+            </w:r>
+            <w:r>
+              <w:rPr>
+                <w:rFonts w:ascii="Calibri" w:hAnsi="Calibri" w:eastAsia="Calibri" w:cs="Calibri"/>
+                <w:color w:val="1f1f1f"/>
+                <w:sz w:val="22"/>
+                <w:szCs w:val="22"/>
+              </w:rPr>
+            </w:r>
+            <w:r>
+              <w:rPr>
+                <w:rFonts w:ascii="Calibri" w:hAnsi="Calibri" w:eastAsia="Calibri" w:cs="Calibri"/>
+                <w:color w:val="1f1f1f"/>
+                <w:sz w:val="22"/>
+                <w:szCs w:val="22"/>
+              </w:rPr>
+            </w:r>
+          </w:p>
+        </w:tc>
+        <w:tc>
+          <w:tcPr>
+            <w:tcBorders/>
+            <w:tcW w:w="1828" w:type="dxa"/>
+            <w:vAlign w:val="center"/>
+            <w:vMerge w:val="restart"/>
+          </w:tcPr>
+          <w:p>
+            <w:pPr>
+              <w:pBdr/>
+              <w:spacing w:after="0" w:before="0" w:line="240" w:lineRule="auto"/>
+              <w:ind/>
+              <w:jc w:val="left"/>
+              <w:rPr>
+                <w:rFonts w:ascii="Calibri" w:hAnsi="Calibri" w:eastAsia="Calibri" w:cs="Calibri"/>
+                <w:color w:val="1f1f1f"/>
+                <w:sz w:val="22"/>
+                <w:szCs w:val="22"/>
+              </w:rPr>
+            </w:pPr>
+            <w:r>
+              <w:rPr>
+                <w:rFonts w:ascii="Calibri" w:hAnsi="Calibri" w:eastAsia="Calibri" w:cs="Calibri"/>
+                <w:color w:val="1f1f1f"/>
+                <w:sz w:val="22"/>
+                <w:szCs w:val="22"/>
+              </w:rPr>
+            </w:r>
+            <w:r>
+              <w:t xml:space="preserve">Texte / Enum</w:t>
+            </w:r>
+            <w:r>
+              <w:rPr>
+                <w:rFonts w:ascii="Calibri" w:hAnsi="Calibri" w:eastAsia="Calibri" w:cs="Calibri"/>
+                <w:color w:val="1f1f1f"/>
+                <w:sz w:val="22"/>
+                <w:szCs w:val="22"/>
+              </w:rPr>
+            </w:r>
+            <w:r>
+              <w:rPr>
+                <w:rFonts w:ascii="Calibri" w:hAnsi="Calibri" w:eastAsia="Calibri" w:cs="Calibri"/>
+                <w:color w:val="1f1f1f"/>
+                <w:sz w:val="22"/>
+                <w:szCs w:val="22"/>
+              </w:rPr>
+            </w:r>
+          </w:p>
+        </w:tc>
+        <w:tc>
+          <w:tcPr>
+            <w:tcBorders/>
+            <w:tcW w:w="3332" w:type="dxa"/>
+            <w:vAlign w:val="center"/>
+            <w:vMerge w:val="restart"/>
+          </w:tcPr>
+          <w:p>
+            <w:pPr>
+              <w:pBdr/>
+              <w:spacing w:after="0" w:before="0" w:line="240" w:lineRule="auto"/>
+              <w:ind/>
+              <w:jc w:val="left"/>
+              <w:rPr>
+                <w:rFonts w:ascii="Calibri" w:hAnsi="Calibri" w:eastAsia="Calibri" w:cs="Calibri"/>
+                <w:color w:val="1f1f1f"/>
+                <w:sz w:val="22"/>
+                <w:szCs w:val="22"/>
+              </w:rPr>
+            </w:pPr>
+            <w:r>
+              <w:rPr>
+                <w:rFonts w:ascii="Calibri" w:hAnsi="Calibri" w:eastAsia="Calibri" w:cs="Calibri"/>
+                <w:color w:val="1f1f1f"/>
+                <w:sz w:val="22"/>
+                <w:szCs w:val="22"/>
+              </w:rPr>
+            </w:r>
+            <w:r>
+              <w:rPr>
+                <w:rFonts w:ascii="Calibri" w:hAnsi="Calibri" w:eastAsia="Calibri" w:cs="Calibri"/>
+                <w:color w:val="1f1f1f"/>
+                <w:sz w:val="22"/>
+                <w:szCs w:val="22"/>
+              </w:rPr>
+              <w:t xml:space="preserve">"M", "TM", "PM"</w:t>
+            </w:r>
+            <w:r>
+              <w:rPr>
+                <w:rFonts w:ascii="Calibri" w:hAnsi="Calibri" w:eastAsia="Calibri" w:cs="Calibri"/>
+                <w:color w:val="1f1f1f"/>
+                <w:sz w:val="22"/>
+                <w:szCs w:val="22"/>
+              </w:rPr>
+            </w:r>
+            <w:r>
+              <w:rPr>
+                <w:rFonts w:ascii="Calibri" w:hAnsi="Calibri" w:eastAsia="Calibri" w:cs="Calibri"/>
+                <w:color w:val="1f1f1f"/>
                 <w:sz w:val="22"/>
                 <w:szCs w:val="22"/>
               </w:rPr>
@@ -7384,7 +7590,7 @@
             </w:r>
             <w:r>
               <w:rPr>
-                <w:rFonts w:ascii="Calibri" w:hAnsi="Calibri" w:eastAsia="Calibri" w:cs="Calibri"/>
+                <w:rFonts w:ascii="Calibri" w:hAnsi="Calibri" w:cs="Calibri"/>
                 <w:sz w:val="22"/>
                 <w:szCs w:val="22"/>
               </w:rPr>
@@ -7427,7 +7633,7 @@
             </w:r>
             <w:r>
               <w:rPr>
-                <w:rFonts w:ascii="Calibri" w:hAnsi="Calibri" w:eastAsia="Calibri" w:cs="Calibri"/>
+                <w:rFonts w:ascii="Calibri" w:hAnsi="Calibri" w:cs="Calibri"/>
                 <w:sz w:val="22"/>
                 <w:szCs w:val="22"/>
               </w:rPr>
@@ -7470,7 +7676,7 @@
             </w:r>
             <w:r>
               <w:rPr>
-                <w:rFonts w:ascii="Calibri" w:hAnsi="Calibri" w:eastAsia="Calibri" w:cs="Calibri"/>
+                <w:rFonts w:ascii="Calibri" w:hAnsi="Calibri" w:cs="Calibri"/>
                 <w:sz w:val="22"/>
                 <w:szCs w:val="22"/>
               </w:rPr>
@@ -7573,7 +7779,7 @@
             </w:r>
             <w:r>
               <w:rPr>
-                <w:rFonts w:ascii="Calibri" w:hAnsi="Calibri" w:eastAsia="Calibri" w:cs="Calibri"/>
+                <w:rFonts w:ascii="Calibri" w:hAnsi="Calibri" w:cs="Calibri"/>
                 <w:sz w:val="22"/>
                 <w:szCs w:val="22"/>
               </w:rPr>
@@ -7616,7 +7822,7 @@
             </w:r>
             <w:r>
               <w:rPr>
-                <w:rFonts w:ascii="Calibri" w:hAnsi="Calibri" w:eastAsia="Calibri" w:cs="Calibri"/>
+                <w:rFonts w:ascii="Calibri" w:hAnsi="Calibri" w:cs="Calibri"/>
                 <w:sz w:val="22"/>
                 <w:szCs w:val="22"/>
               </w:rPr>
@@ -7659,7 +7865,7 @@
             </w:r>
             <w:r>
               <w:rPr>
-                <w:rFonts w:ascii="Calibri" w:hAnsi="Calibri" w:eastAsia="Calibri" w:cs="Calibri"/>
+                <w:rFonts w:ascii="Calibri" w:hAnsi="Calibri" w:cs="Calibri"/>
                 <w:sz w:val="22"/>
                 <w:szCs w:val="22"/>
               </w:rPr>
@@ -7723,7 +7929,7 @@
             </w:r>
             <w:r>
               <w:rPr>
-                <w:rFonts w:ascii="Calibri" w:hAnsi="Calibri" w:eastAsia="Calibri" w:cs="Calibri"/>
+                <w:rFonts w:ascii="Calibri" w:hAnsi="Calibri" w:cs="Calibri"/>
                 <w:sz w:val="22"/>
                 <w:szCs w:val="22"/>
               </w:rPr>
@@ -7766,7 +7972,7 @@
             </w:r>
             <w:r>
               <w:rPr>
-                <w:rFonts w:ascii="Calibri" w:hAnsi="Calibri" w:eastAsia="Calibri" w:cs="Calibri"/>
+                <w:rFonts w:ascii="Calibri" w:hAnsi="Calibri" w:cs="Calibri"/>
                 <w:sz w:val="22"/>
                 <w:szCs w:val="22"/>
               </w:rPr>
@@ -7809,7 +8015,7 @@
             </w:r>
             <w:r>
               <w:rPr>
-                <w:rFonts w:ascii="Calibri" w:hAnsi="Calibri" w:eastAsia="Calibri" w:cs="Calibri"/>
+                <w:rFonts w:ascii="Calibri" w:hAnsi="Calibri" w:cs="Calibri"/>
                 <w:sz w:val="22"/>
                 <w:szCs w:val="22"/>
               </w:rPr>
@@ -7883,7 +8089,7 @@
             </w:r>
             <w:r>
               <w:rPr>
-                <w:rFonts w:ascii="Calibri" w:hAnsi="Calibri" w:eastAsia="Calibri" w:cs="Calibri"/>
+                <w:rFonts w:ascii="Calibri" w:hAnsi="Calibri" w:cs="Calibri"/>
                 <w:sz w:val="22"/>
                 <w:szCs w:val="22"/>
               </w:rPr>
@@ -7926,7 +8132,7 @@
             </w:r>
             <w:r>
               <w:rPr>
-                <w:rFonts w:ascii="Calibri" w:hAnsi="Calibri" w:eastAsia="Calibri" w:cs="Calibri"/>
+                <w:rFonts w:ascii="Calibri" w:hAnsi="Calibri" w:cs="Calibri"/>
                 <w:sz w:val="22"/>
                 <w:szCs w:val="22"/>
               </w:rPr>
@@ -7969,7 +8175,7 @@
             </w:r>
             <w:r>
               <w:rPr>
-                <w:rFonts w:ascii="Calibri" w:hAnsi="Calibri" w:eastAsia="Calibri" w:cs="Calibri"/>
+                <w:rFonts w:ascii="Calibri" w:hAnsi="Calibri" w:cs="Calibri"/>
                 <w:sz w:val="22"/>
                 <w:szCs w:val="22"/>
               </w:rPr>
@@ -8072,7 +8278,7 @@
             </w:r>
             <w:r>
               <w:rPr>
-                <w:rFonts w:ascii="Calibri" w:hAnsi="Calibri" w:eastAsia="Calibri" w:cs="Calibri"/>
+                <w:rFonts w:ascii="Calibri" w:hAnsi="Calibri" w:cs="Calibri"/>
                 <w:sz w:val="22"/>
                 <w:szCs w:val="22"/>
               </w:rPr>
@@ -8115,7 +8321,7 @@
             </w:r>
             <w:r>
               <w:rPr>
-                <w:rFonts w:ascii="Calibri" w:hAnsi="Calibri" w:eastAsia="Calibri" w:cs="Calibri"/>
+                <w:rFonts w:ascii="Calibri" w:hAnsi="Calibri" w:cs="Calibri"/>
                 <w:sz w:val="22"/>
                 <w:szCs w:val="22"/>
               </w:rPr>
@@ -8158,7 +8364,7 @@
             </w:r>
             <w:r>
               <w:rPr>
-                <w:rFonts w:ascii="Calibri" w:hAnsi="Calibri" w:eastAsia="Calibri" w:cs="Calibri"/>
+                <w:rFonts w:ascii="Calibri" w:hAnsi="Calibri" w:cs="Calibri"/>
                 <w:sz w:val="22"/>
                 <w:szCs w:val="22"/>
               </w:rPr>
@@ -8222,7 +8428,7 @@
             </w:r>
             <w:r>
               <w:rPr>
-                <w:rFonts w:ascii="Calibri" w:hAnsi="Calibri" w:eastAsia="Calibri" w:cs="Calibri"/>
+                <w:rFonts w:ascii="Calibri" w:hAnsi="Calibri" w:cs="Calibri"/>
                 <w:sz w:val="22"/>
                 <w:szCs w:val="22"/>
               </w:rPr>
@@ -8265,7 +8471,7 @@
             </w:r>
             <w:r>
               <w:rPr>
-                <w:rFonts w:ascii="Calibri" w:hAnsi="Calibri" w:eastAsia="Calibri" w:cs="Calibri"/>
+                <w:rFonts w:ascii="Calibri" w:hAnsi="Calibri" w:cs="Calibri"/>
                 <w:sz w:val="22"/>
                 <w:szCs w:val="22"/>
               </w:rPr>
@@ -8308,7 +8514,7 @@
             </w:r>
             <w:r>
               <w:rPr>
-                <w:rFonts w:ascii="Calibri" w:hAnsi="Calibri" w:eastAsia="Calibri" w:cs="Calibri"/>
+                <w:rFonts w:ascii="Calibri" w:hAnsi="Calibri" w:cs="Calibri"/>
                 <w:sz w:val="22"/>
                 <w:szCs w:val="22"/>
               </w:rPr>
@@ -8372,7 +8578,7 @@
             </w:r>
             <w:r>
               <w:rPr>
-                <w:rFonts w:ascii="Calibri" w:hAnsi="Calibri" w:eastAsia="Calibri" w:cs="Calibri"/>
+                <w:rFonts w:ascii="Calibri" w:hAnsi="Calibri" w:cs="Calibri"/>
                 <w:sz w:val="22"/>
                 <w:szCs w:val="22"/>
               </w:rPr>
@@ -8415,7 +8621,7 @@
             </w:r>
             <w:r>
               <w:rPr>
-                <w:rFonts w:ascii="Calibri" w:hAnsi="Calibri" w:eastAsia="Calibri" w:cs="Calibri"/>
+                <w:rFonts w:ascii="Calibri" w:hAnsi="Calibri" w:cs="Calibri"/>
                 <w:sz w:val="22"/>
                 <w:szCs w:val="22"/>
               </w:rPr>
@@ -8458,7 +8664,7 @@
             </w:r>
             <w:r>
               <w:rPr>
-                <w:rFonts w:ascii="Calibri" w:hAnsi="Calibri" w:eastAsia="Calibri" w:cs="Calibri"/>
+                <w:rFonts w:ascii="Calibri" w:hAnsi="Calibri" w:cs="Calibri"/>
                 <w:sz w:val="22"/>
                 <w:szCs w:val="22"/>
               </w:rPr>
@@ -8522,7 +8728,7 @@
             </w:r>
             <w:r>
               <w:rPr>
-                <w:rFonts w:ascii="Calibri" w:hAnsi="Calibri" w:eastAsia="Calibri" w:cs="Calibri"/>
+                <w:rFonts w:ascii="Calibri" w:hAnsi="Calibri" w:cs="Calibri"/>
                 <w:sz w:val="22"/>
                 <w:szCs w:val="22"/>
               </w:rPr>
@@ -8565,7 +8771,7 @@
             </w:r>
             <w:r>
               <w:rPr>
-                <w:rFonts w:ascii="Calibri" w:hAnsi="Calibri" w:eastAsia="Calibri" w:cs="Calibri"/>
+                <w:rFonts w:ascii="Calibri" w:hAnsi="Calibri" w:cs="Calibri"/>
                 <w:sz w:val="22"/>
                 <w:szCs w:val="22"/>
               </w:rPr>
@@ -8608,7 +8814,7 @@
             </w:r>
             <w:r>
               <w:rPr>
-                <w:rFonts w:ascii="Calibri" w:hAnsi="Calibri" w:eastAsia="Calibri" w:cs="Calibri"/>
+                <w:rFonts w:ascii="Calibri" w:hAnsi="Calibri" w:cs="Calibri"/>
                 <w:sz w:val="22"/>
                 <w:szCs w:val="22"/>
               </w:rPr>
@@ -8682,7 +8888,7 @@
             </w:r>
             <w:r>
               <w:rPr>
-                <w:rFonts w:ascii="Calibri" w:hAnsi="Calibri" w:eastAsia="Calibri" w:cs="Calibri"/>
+                <w:rFonts w:ascii="Calibri" w:hAnsi="Calibri" w:cs="Calibri"/>
                 <w:sz w:val="22"/>
                 <w:szCs w:val="22"/>
               </w:rPr>
@@ -8725,7 +8931,7 @@
             </w:r>
             <w:r>
               <w:rPr>
-                <w:rFonts w:ascii="Calibri" w:hAnsi="Calibri" w:eastAsia="Calibri" w:cs="Calibri"/>
+                <w:rFonts w:ascii="Calibri" w:hAnsi="Calibri" w:cs="Calibri"/>
                 <w:sz w:val="22"/>
                 <w:szCs w:val="22"/>
               </w:rPr>
@@ -8768,7 +8974,7 @@
             </w:r>
             <w:r>
               <w:rPr>
-                <w:rFonts w:ascii="Calibri" w:hAnsi="Calibri" w:eastAsia="Calibri" w:cs="Calibri"/>
+                <w:rFonts w:ascii="Calibri" w:hAnsi="Calibri" w:cs="Calibri"/>
                 <w:sz w:val="22"/>
                 <w:szCs w:val="22"/>
               </w:rPr>
@@ -8842,7 +9048,7 @@
             </w:r>
             <w:r>
               <w:rPr>
-                <w:rFonts w:ascii="Calibri" w:hAnsi="Calibri" w:eastAsia="Calibri" w:cs="Calibri"/>
+                <w:rFonts w:ascii="Calibri" w:hAnsi="Calibri" w:cs="Calibri"/>
                 <w:sz w:val="22"/>
                 <w:szCs w:val="22"/>
               </w:rPr>
@@ -8885,7 +9091,7 @@
             </w:r>
             <w:r>
               <w:rPr>
-                <w:rFonts w:ascii="Calibri" w:hAnsi="Calibri" w:eastAsia="Calibri" w:cs="Calibri"/>
+                <w:rFonts w:ascii="Calibri" w:hAnsi="Calibri" w:cs="Calibri"/>
                 <w:sz w:val="22"/>
                 <w:szCs w:val="22"/>
               </w:rPr>
@@ -8928,7 +9134,7 @@
             </w:r>
             <w:r>
               <w:rPr>
-                <w:rFonts w:ascii="Calibri" w:hAnsi="Calibri" w:eastAsia="Calibri" w:cs="Calibri"/>
+                <w:rFonts w:ascii="Calibri" w:hAnsi="Calibri" w:cs="Calibri"/>
                 <w:sz w:val="22"/>
                 <w:szCs w:val="22"/>
               </w:rPr>
@@ -9031,7 +9237,7 @@
             </w:r>
             <w:r>
               <w:rPr>
-                <w:rFonts w:ascii="Calibri" w:hAnsi="Calibri" w:eastAsia="Calibri" w:cs="Calibri"/>
+                <w:rFonts w:ascii="Calibri" w:hAnsi="Calibri" w:cs="Calibri"/>
                 <w:sz w:val="22"/>
                 <w:szCs w:val="22"/>
               </w:rPr>
@@ -9074,7 +9280,7 @@
             </w:r>
             <w:r>
               <w:rPr>
-                <w:rFonts w:ascii="Calibri" w:hAnsi="Calibri" w:eastAsia="Calibri" w:cs="Calibri"/>
+                <w:rFonts w:ascii="Calibri" w:hAnsi="Calibri" w:cs="Calibri"/>
                 <w:sz w:val="22"/>
                 <w:szCs w:val="22"/>
               </w:rPr>
@@ -9117,7 +9323,7 @@
             </w:r>
             <w:r>
               <w:rPr>
-                <w:rFonts w:ascii="Calibri" w:hAnsi="Calibri" w:eastAsia="Calibri" w:cs="Calibri"/>
+                <w:rFonts w:ascii="Calibri" w:hAnsi="Calibri" w:cs="Calibri"/>
                 <w:sz w:val="22"/>
                 <w:szCs w:val="22"/>
               </w:rPr>
@@ -9181,7 +9387,7 @@
             </w:r>
             <w:r>
               <w:rPr>
-                <w:rFonts w:ascii="Calibri" w:hAnsi="Calibri" w:eastAsia="Calibri" w:cs="Calibri"/>
+                <w:rFonts w:ascii="Calibri" w:hAnsi="Calibri" w:cs="Calibri"/>
                 <w:sz w:val="22"/>
                 <w:szCs w:val="22"/>
               </w:rPr>
@@ -9224,7 +9430,7 @@
             </w:r>
             <w:r>
               <w:rPr>
-                <w:rFonts w:ascii="Calibri" w:hAnsi="Calibri" w:eastAsia="Calibri" w:cs="Calibri"/>
+                <w:rFonts w:ascii="Calibri" w:hAnsi="Calibri" w:cs="Calibri"/>
                 <w:sz w:val="22"/>
                 <w:szCs w:val="22"/>
               </w:rPr>
@@ -9267,7 +9473,7 @@
             </w:r>
             <w:r>
               <w:rPr>
-                <w:rFonts w:ascii="Calibri" w:hAnsi="Calibri" w:eastAsia="Calibri" w:cs="Calibri"/>
+                <w:rFonts w:ascii="Calibri" w:hAnsi="Calibri" w:cs="Calibri"/>
                 <w:sz w:val="22"/>
                 <w:szCs w:val="22"/>
               </w:rPr>
@@ -9327,14 +9533,17 @@
                 <w:sz w:val="22"/>
                 <w:szCs w:val="22"/>
               </w:rPr>
-              <w:t xml:space="preserve">not_description</w:t>
+              <w:t xml:space="preserve">not_</w:t>
             </w:r>
             <w:r>
               <w:rPr>
                 <w:rFonts w:ascii="Calibri" w:hAnsi="Calibri" w:eastAsia="Calibri" w:cs="Calibri"/>
+                <w:color w:val="1f1f1f"/>
                 <w:sz w:val="22"/>
                 <w:szCs w:val="22"/>
+                <w:lang w:val="fr-CH"/>
               </w:rPr>
+              <w:t xml:space="preserve">titre</w:t>
             </w:r>
             <w:r>
               <w:rPr>
@@ -9374,7 +9583,7 @@
             </w:r>
             <w:r>
               <w:rPr>
-                <w:rFonts w:ascii="Calibri" w:hAnsi="Calibri" w:eastAsia="Calibri" w:cs="Calibri"/>
+                <w:rFonts w:ascii="Calibri" w:hAnsi="Calibri" w:cs="Calibri"/>
                 <w:sz w:val="22"/>
                 <w:szCs w:val="22"/>
               </w:rPr>
@@ -9417,7 +9626,7 @@
             </w:r>
             <w:r>
               <w:rPr>
-                <w:rFonts w:ascii="Calibri" w:hAnsi="Calibri" w:eastAsia="Calibri" w:cs="Calibri"/>
+                <w:rFonts w:ascii="Calibri" w:hAnsi="Calibri" w:cs="Calibri"/>
                 <w:sz w:val="22"/>
                 <w:szCs w:val="22"/>
               </w:rPr>
@@ -9481,7 +9690,7 @@
             </w:r>
             <w:r>
               <w:rPr>
-                <w:rFonts w:ascii="Calibri" w:hAnsi="Calibri" w:eastAsia="Calibri" w:cs="Calibri"/>
+                <w:rFonts w:ascii="Calibri" w:hAnsi="Calibri" w:cs="Calibri"/>
                 <w:sz w:val="22"/>
                 <w:szCs w:val="22"/>
               </w:rPr>
@@ -9524,7 +9733,7 @@
             </w:r>
             <w:r>
               <w:rPr>
-                <w:rFonts w:ascii="Calibri" w:hAnsi="Calibri" w:eastAsia="Calibri" w:cs="Calibri"/>
+                <w:rFonts w:ascii="Calibri" w:hAnsi="Calibri" w:cs="Calibri"/>
                 <w:sz w:val="22"/>
                 <w:szCs w:val="22"/>
               </w:rPr>
@@ -9567,7 +9776,7 @@
             </w:r>
             <w:r>
               <w:rPr>
-                <w:rFonts w:ascii="Calibri" w:hAnsi="Calibri" w:eastAsia="Calibri" w:cs="Calibri"/>
+                <w:rFonts w:ascii="Calibri" w:hAnsi="Calibri" w:cs="Calibri"/>
                 <w:sz w:val="22"/>
                 <w:szCs w:val="22"/>
               </w:rPr>
@@ -9641,7 +9850,7 @@
             </w:r>
             <w:r>
               <w:rPr>
-                <w:rFonts w:ascii="Calibri" w:hAnsi="Calibri" w:eastAsia="Calibri" w:cs="Calibri"/>
+                <w:rFonts w:ascii="Calibri" w:hAnsi="Calibri" w:cs="Calibri"/>
                 <w:sz w:val="22"/>
                 <w:szCs w:val="22"/>
               </w:rPr>
@@ -9684,7 +9893,7 @@
             </w:r>
             <w:r>
               <w:rPr>
-                <w:rFonts w:ascii="Calibri" w:hAnsi="Calibri" w:eastAsia="Calibri" w:cs="Calibri"/>
+                <w:rFonts w:ascii="Calibri" w:hAnsi="Calibri" w:cs="Calibri"/>
                 <w:sz w:val="22"/>
                 <w:szCs w:val="22"/>
               </w:rPr>
@@ -9727,7 +9936,7 @@
             </w:r>
             <w:r>
               <w:rPr>
-                <w:rFonts w:ascii="Calibri" w:hAnsi="Calibri" w:eastAsia="Calibri" w:cs="Calibri"/>
+                <w:rFonts w:ascii="Calibri" w:hAnsi="Calibri" w:cs="Calibri"/>
                 <w:sz w:val="22"/>
                 <w:szCs w:val="22"/>
               </w:rPr>
@@ -14925,7 +15134,7 @@
                 <w:szCs w:val="24"/>
                 <w:lang w:val="fr-CH"/>
               </w:rPr>
-              <w:t xml:space="preserve">10.03.26</w:t>
+              <w:t xml:space="preserve">18.03.26</w:t>
             </w:r>
             <w:r>
               <w:rPr>
@@ -15282,7 +15491,7 @@
                 <w:szCs w:val="24"/>
                 <w:lang w:val="fr-CH"/>
               </w:rPr>
-              <w:t xml:space="preserve">10.03.26</w:t>
+              <w:t xml:space="preserve">18.03.26</w:t>
             </w:r>
             <w:r>
               <w:rPr>
@@ -15562,7 +15771,7 @@
                 <w:szCs w:val="24"/>
                 <w:lang w:val="fr-CH"/>
               </w:rPr>
-              <w:t xml:space="preserve">10.03.26</w:t>
+              <w:t xml:space="preserve">18.03.26</w:t>
             </w:r>
             <w:r>
               <w:rPr>
@@ -15824,7 +16033,7 @@
                 <w:szCs w:val="24"/>
                 <w:lang w:val="fr-CH"/>
               </w:rPr>
-              <w:t xml:space="preserve">10.03.26</w:t>
+              <w:t xml:space="preserve">18.03.26</w:t>
             </w:r>
             <w:r>
               <w:rPr>
@@ -16105,7 +16314,7 @@
                 <w:szCs w:val="24"/>
                 <w:lang w:val="fr-CH"/>
               </w:rPr>
-              <w:t xml:space="preserve">10.03.26</w:t>
+              <w:t xml:space="preserve">18.03.26</w:t>
             </w:r>
             <w:r>
               <w:rPr>

</xml_diff>